<commit_message>
Dokumentation auf Stand 2.19.0: behobene Fehler, Konstruktion, CNC-Logik
Co-Authored-By: Claude Opus 5.5 (1M context) <noreply@anthropic.com>
Claude-Session: https://claude.ai/code/session_01KHhbEGS7E9AgDDqayPcjgN
</commit_message>
<xml_diff>
--- a/Treppenbau-Plugin für SketchUp – Dokumentation.docx
+++ b/Treppenbau-Plugin für SketchUp – Dokumentation.docx
@@ -26,7 +26,7 @@
         <w:rPr>
           <w:lang w:val="de-DE"/>
         </w:rPr>
-        <w:t>Oct 6, 2026 · @Jürgen Späder · Version 2.17.0</w:t>
+        <w:t>Oct 6, 2026 · @Jürgen Späder · Version 2.19.0</w:t>
       </w:r>
     </w:p>
     <w:p>
@@ -53,7 +53,7 @@
         <w:rPr>
           <w:lang w:val="de-DE"/>
         </w:rPr>
-        <w:t xml:space="preserve">Treppenbau (Version 2.17.0) erzeugt in SketchUp parametrische Treppen – gerade, gewendelt, mit Podest oder als Wendeltreppe – und gibt die Holzteile als fertige TCN-Fräsprogramme für TpaCAD aus. Alle Maße im Treppendialog sind in </w:t>
+        <w:t xml:space="preserve">Treppenbau (Version 2.19.0) erzeugt in SketchUp parametrische Treppen – gerade, gewendelt, mit Podest oder als Wendeltreppe – und gibt die Holzteile als fertige TCN-Fräsprogramme für TpaCAD aus. Alle Maße im Treppendialog sind in </w:t>
       </w:r>
       <w:r>
         <w:rPr>
@@ -195,7 +195,6 @@
       </w:pPr>
       <w:r>
         <w:rPr>
-          <w:b/>
           <w:lang w:val="de-DE"/>
         </w:rPr>
         <w:t>CNC-Export: Teile zerlegen; Tritt- und Setzstufen auf Rohplatten verschachteln (höchstens Maschinenbreite 1300 mm), Wangen, geschwungene Handläufe und Geländerpfosten je Teil eine eigene TCN (überlang in zwei Läufen), dazu Teileliste.csv, Fräsliste .xmlst und Nacharbeit-Text. Gravur und Zielordner teilt sich das Plugin mit dxf4tcn.</w:t>
@@ -264,7 +263,7 @@
         <w:rPr>
           <w:lang w:val="de-DE"/>
         </w:rPr>
-        <w:t>Diese Fassung beschreibt Version 2.17.0 (treppenbau_2.17.0.rbz). Die vorige Fassung (02.10.2026) entsprach Version 2.6.0. Seitdem sind die folgenden Änderungen hinzugekommen; die betroffenen Abschnitte weiter unten (Installation, Parameter, Export und CNC, Einschränkungen) sind entsprechend ergänzt. Alles wurde bisher nur mit Testskripten außerhalb von SketchUp und TpaCAD geprüft.</w:t>
+        <w:t>Diese Fassung beschreibt Version 2.19.0 (treppenbau_2.19.0.rbz). Die vorige Fassung (02.10.2026) entsprach Version 2.6.0. Seitdem sind die folgenden Änderungen hinzugekommen; die betroffenen Abschnitte weiter unten sind ergänzt. Neu sind außerdem die Abschnitte „Behobene Fehler“, „Konstruktion – warum was wie aufgebaut ist“ und „CNC-Logik“. Alles wurde bisher nur mit Testskripten außerhalb von SketchUp und TpaCAD geprüft.</w:t>
       </w:r>
     </w:p>
     <w:tbl>
@@ -967,6 +966,82 @@
           </w:p>
         </w:tc>
       </w:tr>
+      <w:tr>
+        <w:tc>
+          <w:tcPr>
+            <w:tcW w:w="4680" w:type="dxa"/>
+          </w:tcPr>
+          <w:p>
+            <w:pPr>
+              <w:rPr>
+                <w:lang w:val="de-DE"/>
+              </w:rPr>
+            </w:pPr>
+            <w:r>
+              <w:rPr>
+                <w:lang w:val="de-DE"/>
+              </w:rPr>
+              <w:t>2.18.0</w:t>
+            </w:r>
+          </w:p>
+        </w:tc>
+        <w:tc>
+          <w:tcPr>
+            <w:tcW w:w="4680" w:type="dxa"/>
+          </w:tcPr>
+          <w:p>
+            <w:pPr>
+              <w:rPr>
+                <w:lang w:val="de-DE"/>
+              </w:rPr>
+            </w:pPr>
+            <w:r>
+              <w:rPr>
+                <w:lang w:val="de-DE"/>
+              </w:rPr>
+              <w:t>Halbgewendelt: Innenwange am Zwischenstück stumpf; Handlauf nie dünner als rail_hh</w:t>
+            </w:r>
+          </w:p>
+        </w:tc>
+      </w:tr>
+      <w:tr>
+        <w:tc>
+          <w:tcPr>
+            <w:tcW w:w="4680" w:type="dxa"/>
+          </w:tcPr>
+          <w:p>
+            <w:pPr>
+              <w:rPr>
+                <w:lang w:val="de-DE"/>
+              </w:rPr>
+            </w:pPr>
+            <w:r>
+              <w:rPr>
+                <w:lang w:val="de-DE"/>
+              </w:rPr>
+              <w:t>2.19.0</w:t>
+            </w:r>
+          </w:p>
+        </w:tc>
+        <w:tc>
+          <w:tcPr>
+            <w:tcW w:w="4680" w:type="dxa"/>
+          </w:tcPr>
+          <w:p>
+            <w:pPr>
+              <w:rPr>
+                <w:lang w:val="de-DE"/>
+              </w:rPr>
+            </w:pPr>
+            <w:r>
+              <w:rPr>
+                <w:lang w:val="de-DE"/>
+              </w:rPr>
+              <w:t>Dübel zwischen Stufe und aufgesattelter Wange (Wange CNC, Stufe Bohrliste)</w:t>
+            </w:r>
+          </w:p>
+        </w:tc>
+      </w:tr>
     </w:tbl>
     <w:p>
       <w:pPr>
@@ -979,7 +1054,7 @@
         <w:rPr>
           <w:lang w:val="de-DE"/>
         </w:rPr>
-        <w:t>Version 2.17.0 – CNC-Vorschau mit Bohrungen</w:t>
+        <w:t>Version 2.19.0 – Dübel zwischen Stufe und aufgesattelter Wange</w:t>
       </w:r>
     </w:p>
     <w:p>
@@ -997,7 +1072,7 @@
         <w:rPr>
           <w:lang w:val="de-DE"/>
         </w:rPr>
-        <w:t>Die Vorschau zeigt bei Teilen mit eigenem Rohling (eingestemmte Wangen, Handläufe, Pfosten) die Bohrungen für Geländerstäbe und Dübel. In den TCN-Dateien waren sie schon enthalten, auch bei überlangen Wangen in Lauf A und B.</w:t>
+        <w:t>Je Auflager 2 Dübel Ø 10 mm (sat_dowels, sat_dowel_d), auf ¼ und ¾ der Auflagerlänge, mittig in der Wangendicke; Bohrtiefe je Teil wie dowel_depth, in der Stufe höchstens Stufendicke − 1 cm.</w:t>
       </w:r>
     </w:p>
     <w:p>
@@ -1015,21 +1090,7 @@
         <w:rPr>
           <w:lang w:val="de-DE"/>
         </w:rPr>
-        <w:t>Die Teilung überlanger Teile ist mit „Lauf A · Feld N1“ und „Lauf B · Feld N (180° gedreht)“ beschriftet.</w:t>
-      </w:r>
-    </w:p>
-    <w:p>
-      <w:pPr>
-        <w:pStyle w:val="Heading3"/>
-        <w:rPr>
-          <w:lang w:val="de-DE"/>
-        </w:rPr>
-      </w:pPr>
-      <w:r>
-        <w:rPr>
-          <w:lang w:val="de-DE"/>
-        </w:rPr>
-        <w:t>Version 2.16.0 – TCN: Maschinenbreite, Pfosten, Stäbe, gerade Handläufe</w:t>
+        <w:t>Die Wange bohrt die CNC mit dem Bohraggregat waagerecht in die Auflagerkante (auch bei überlangen Wangen in Lauf A/B; bei „nur markieren“ eine Markierung).</w:t>
       </w:r>
     </w:p>
     <w:p>
@@ -1047,7 +1108,21 @@
         <w:rPr>
           <w:lang w:val="de-DE"/>
         </w:rPr>
-        <w:t>Keine TCN ist breiter als die Maschine: neuer CNC-Wert Maschinenbreite Y (mach_w, 1300 mm), Rohplattenbreite jetzt Standard 1300 mm. Breitere Rohlinge werden nicht exportiert (Teileliste: NICHT EXPORTIERT).</w:t>
+        <w:t>Die Stufen werden von unten von Hand gebohrt: Bohrliste in …_Nacharbeit.txt mit Abstand von der Vorderkante und vom Stufenende je Stufe und Seite. Stabbohrungen in derselben Stufe werden umgangen.</w:t>
+      </w:r>
+    </w:p>
+    <w:p>
+      <w:pPr>
+        <w:pStyle w:val="Heading3"/>
+        <w:rPr>
+          <w:lang w:val="de-DE"/>
+        </w:rPr>
+      </w:pPr>
+      <w:r>
+        <w:rPr>
+          <w:lang w:val="de-DE"/>
+        </w:rPr>
+        <w:t>Version 2.18.0 – Halbgewendelt: Zwischenstück</w:t>
       </w:r>
     </w:p>
     <w:p>
@@ -1065,7 +1140,7 @@
         <w:rPr>
           <w:lang w:val="de-DE"/>
         </w:rPr>
-        <w:t>Jeder Geländerpfosten bekommt eine eigene TCN (…_Gelaenderpfosten_G1.tcn).</w:t>
+        <w:t>Die Innenwange des 2. Laufs hat am Zwischenstück keine Spitze mehr: ihre Unterkante reicht bis zur Unterkante des Zwischenstücks, das so vollflächig anliegt (gerade und geschwungene Wangen).</w:t>
       </w:r>
     </w:p>
     <w:p>
@@ -1083,7 +1158,21 @@
         <w:rPr>
           <w:lang w:val="de-DE"/>
         </w:rPr>
-        <w:t>Geländerstäbe werden nicht gefräst: nur Teileliste („keine TCN“) und …_Nacharbeit.txt mit Querschnitt und Länge je Stab.</w:t>
+        <w:t>Der Handlauf ist überall mindestens rail_hh dick, rechtwinklig zur Handlaufachse gemessen. Vorher wurde er an steilen Stellen (innen am Zwischenstück) bis auf gut 2 cm dünn, sodass keine Stäbe mehr hineinpassten.</w:t>
+      </w:r>
+    </w:p>
+    <w:p>
+      <w:pPr>
+        <w:pStyle w:val="Heading3"/>
+        <w:rPr>
+          <w:lang w:val="de-DE"/>
+        </w:rPr>
+      </w:pPr>
+      <w:r>
+        <w:rPr>
+          <w:lang w:val="de-DE"/>
+        </w:rPr>
+        <w:t>Version 2.17.0 – CNC-Vorschau mit Bohrungen</w:t>
       </w:r>
     </w:p>
     <w:p>
@@ -1101,7 +1190,7 @@
         <w:rPr>
           <w:lang w:val="de-DE"/>
         </w:rPr>
-        <w:t>Gerade Handläufe werden klassisch gefertigt: keine TCN, in der Nacharbeit Länge, Querschnitt, Neigung und die Bohrungen (Abstand entlang der Unterkante). Geschwungene Handläufe bleiben TCN.</w:t>
+        <w:t>Die Vorschau zeigt bei Teilen mit eigenem Rohling (eingestemmte Wangen, Handläufe, Pfosten) die Bohrungen für Geländerstäbe und Dübel. In den TCN-Dateien waren sie schon enthalten, auch bei überlangen Wangen in Lauf A und B.</w:t>
       </w:r>
     </w:p>
     <w:p>
@@ -1119,7 +1208,7 @@
         <w:rPr>
           <w:lang w:val="de-DE"/>
         </w:rPr>
-        <w:t>…_Wangen_Nacharbeit.txt heißt jetzt …_Nacharbeit.txt.</w:t>
+        <w:t>Die Teilung überlanger Teile ist mit „Lauf A · Feld N1“ und „Lauf B · Feld N (180° gedreht)“ beschriftet.</w:t>
       </w:r>
     </w:p>
     <w:p>
@@ -1133,7 +1222,7 @@
         <w:rPr>
           <w:lang w:val="de-DE"/>
         </w:rPr>
-        <w:t>Version 2.15.0 – Gleicher Stababstand</w:t>
+        <w:t>Version 2.16.0 – TCN: Maschinenbreite, Pfosten, Stäbe, gerade Handläufe</w:t>
       </w:r>
     </w:p>
     <w:p>
@@ -1151,7 +1240,7 @@
         <w:rPr>
           <w:lang w:val="de-DE"/>
         </w:rPr>
-        <w:t>Alle Stäbe einer Geländerseite haben denselben waagerechten Abstand, bei eingestemmten und aufgesattelten Wangen. Das frühere Stufenraster entfällt.</w:t>
+        <w:t>Keine TCN ist breiter als die Maschine: neuer CNC-Wert Maschinenbreite Y (mach_w, 1300 mm), Rohplattenbreite jetzt Standard 1300 mm. Breitere Rohlinge werden nicht exportiert (Teileliste: NICHT EXPORTIERT).</w:t>
       </w:r>
     </w:p>
     <w:p>
@@ -1169,21 +1258,7 @@
         <w:rPr>
           <w:lang w:val="de-DE"/>
         </w:rPr>
-        <w:t>Stäbe auf Stufen: die Reihe wird so verschoben (und der Abstand bei Bedarf etwas verkleinert), dass möglichst kein Stab näher als bal_edge an einer Stufenkante steht; verbleibende Fälle als Warnung.</w:t>
-      </w:r>
-    </w:p>
-    <w:p>
-      <w:pPr>
-        <w:pStyle w:val="Heading3"/>
-        <w:rPr>
-          <w:lang w:val="de-DE"/>
-        </w:rPr>
-      </w:pPr>
-      <w:r>
-        <w:rPr>
-          <w:lang w:val="de-DE"/>
-        </w:rPr>
-        <w:t>Version 2.14.0 – Fräsliste für TpaCAD</w:t>
+        <w:t>Jeder Geländerpfosten bekommt eine eigene TCN (…_Gelaenderpfosten_G1.tcn).</w:t>
       </w:r>
     </w:p>
     <w:p>
@@ -1201,21 +1276,7 @@
         <w:rPr>
           <w:lang w:val="de-DE"/>
         </w:rPr>
-        <w:t>Der Export schreibt zusätzlich Liste_&lt;Name&gt;.xmlst mit einer Zeile je TCN (Maße und Feld aus der Datei).</w:t>
-      </w:r>
-    </w:p>
-    <w:p>
-      <w:pPr>
-        <w:pStyle w:val="Heading3"/>
-        <w:rPr>
-          <w:lang w:val="de-DE"/>
-        </w:rPr>
-      </w:pPr>
-      <w:r>
-        <w:rPr>
-          <w:lang w:val="de-DE"/>
-        </w:rPr>
-        <w:t>Version 2.13.0 – Stufen im Pfosten, Dübel</w:t>
+        <w:t>Geländerstäbe werden nicht gefräst: nur Teileliste („keine TCN“) und …_Nacharbeit.txt mit Querschnitt und Länge je Stab.</w:t>
       </w:r>
     </w:p>
     <w:p>
@@ -1233,7 +1294,7 @@
         <w:rPr>
           <w:lang w:val="de-DE"/>
         </w:rPr>
-        <w:t>Tritt- und Setzstufen laufen um post_pocket (1,5 cm) in eine Tasche der Pfosten; Befestigung je Tasche mit Schraube oder Dübel durch den Pfosten (tread_fix, tread_fix_d).</w:t>
+        <w:t>Gerade Handläufe werden klassisch gefertigt: keine TCN, in der Nacharbeit Länge, Querschnitt, Neigung und die Bohrungen (Abstand entlang der Unterkante). Geschwungene Handläufe bleiben TCN.</w:t>
       </w:r>
     </w:p>
     <w:p>
@@ -1251,7 +1312,21 @@
         <w:rPr>
           <w:lang w:val="de-DE"/>
         </w:rPr>
-        <w:t>Wangen und Pfosten werden verdübelt (dowel_d, dowel_depth); eingestemmte Wangen bekommen die Stirnbohrungen im TCN.</w:t>
+        <w:t>…_Wangen_Nacharbeit.txt heißt jetzt …_Nacharbeit.txt.</w:t>
+      </w:r>
+    </w:p>
+    <w:p>
+      <w:pPr>
+        <w:pStyle w:val="Heading3"/>
+        <w:rPr>
+          <w:lang w:val="de-DE"/>
+        </w:rPr>
+      </w:pPr>
+      <w:r>
+        <w:rPr>
+          <w:lang w:val="de-DE"/>
+        </w:rPr>
+        <w:t>Version 2.15.0 – Gleicher Stababstand</w:t>
       </w:r>
     </w:p>
     <w:p>
@@ -1269,21 +1344,7 @@
         <w:rPr>
           <w:lang w:val="de-DE"/>
         </w:rPr>
-        <w:t>Neue Datei …_Pfosten_Bearbeitung.txt mit Taschen und Bohrungen je Pfostenfläche.</w:t>
-      </w:r>
-    </w:p>
-    <w:p>
-      <w:pPr>
-        <w:pStyle w:val="Heading3"/>
-        <w:rPr>
-          <w:lang w:val="de-DE"/>
-        </w:rPr>
-      </w:pPr>
-      <w:r>
-        <w:rPr>
-          <w:lang w:val="de-DE"/>
-        </w:rPr>
-        <w:t>Version 2.12.0 – Überlange Wangen in zwei Läufen</w:t>
+        <w:t>Alle Stäbe einer Geländerseite haben denselben waagerechten Abstand, bei eingestemmten und aufgesattelten Wangen. Das frühere Stufenraster entfällt.</w:t>
       </w:r>
     </w:p>
     <w:p>
@@ -1301,7 +1362,21 @@
         <w:rPr>
           <w:lang w:val="de-DE"/>
         </w:rPr>
-        <w:t>Teile länger als der Verfahrweg (mach_l, 3200 mm) werden in zwei Läufe geteilt: Lauf A im Feld N1 (Ende A am linken X-Anschlag, Kante 1 vorne), dann das Teil um 180° drehen, Lauf B im Feld N (Ende B am selben Anschlag, Kante 1 hinten).</w:t>
+        <w:t>Stäbe auf Stufen: die Reihe wird so verschoben (und der Abstand bei Bedarf etwas verkleinert), dass möglichst kein Stab näher als bal_edge an einer Stufenkante steht; verbleibende Fälle als Warnung.</w:t>
+      </w:r>
+    </w:p>
+    <w:p>
+      <w:pPr>
+        <w:pStyle w:val="Heading3"/>
+        <w:rPr>
+          <w:lang w:val="de-DE"/>
+        </w:rPr>
+      </w:pPr>
+      <w:r>
+        <w:rPr>
+          <w:lang w:val="de-DE"/>
+        </w:rPr>
+        <w:t>Version 2.14.0 – Fräsliste für TpaCAD</w:t>
       </w:r>
     </w:p>
     <w:p>
@@ -1319,7 +1394,21 @@
         <w:rPr>
           <w:lang w:val="de-DE"/>
         </w:rPr>
-        <w:t>Teilung zwischen den Bearbeitungen, Außenkontur überlappend (long_overlap), Haltestege im ersten Lauf (tab_n, tab_w, tab_h); Einrichtblatt in der Nacharbeit.</w:t>
+        <w:t>Der Export schreibt zusätzlich Liste_&lt;Name&gt;.xmlst mit einer Zeile je TCN (Maße und Feld aus der Datei).</w:t>
+      </w:r>
+    </w:p>
+    <w:p>
+      <w:pPr>
+        <w:pStyle w:val="Heading3"/>
+        <w:rPr>
+          <w:lang w:val="de-DE"/>
+        </w:rPr>
+      </w:pPr>
+      <w:r>
+        <w:rPr>
+          <w:lang w:val="de-DE"/>
+        </w:rPr>
+        <w:t>Version 2.13.0 – Stufen im Pfosten, Dübel</w:t>
       </w:r>
     </w:p>
     <w:p>
@@ -1337,21 +1426,7 @@
         <w:rPr>
           <w:lang w:val="de-DE"/>
         </w:rPr>
-        <w:t>Wangen und Handläufe werden nie verschachtelt: jedes Teil hat einen eigenen Rohling (blank_margin), damit das Bohraggregat an die Kanten kommt.</w:t>
-      </w:r>
-    </w:p>
-    <w:p>
-      <w:pPr>
-        <w:pStyle w:val="Heading3"/>
-        <w:rPr>
-          <w:lang w:val="de-DE"/>
-        </w:rPr>
-      </w:pPr>
-      <w:r>
-        <w:rPr>
-          <w:lang w:val="de-DE"/>
-        </w:rPr>
-        <w:t>Version 2.11.0 – Geländer-Korrekturen</w:t>
+        <w:t>Tritt- und Setzstufen laufen um post_pocket (1,5 cm) in eine Tasche der Pfosten; Befestigung je Tasche mit Schraube oder Dübel durch den Pfosten (tread_fix, tread_fix_d).</w:t>
       </w:r>
     </w:p>
     <w:p>
@@ -1369,7 +1444,7 @@
         <w:rPr>
           <w:lang w:val="de-DE"/>
         </w:rPr>
-        <w:t>Stäbe sind oben lotrecht in den Handlauf gebohrt; der Handlauf endet genau an der Pfostenfläche.</w:t>
+        <w:t>Wangen und Pfosten werden verdübelt (dowel_d, dowel_depth); eingestemmte Wangen bekommen die Stirnbohrungen im TCN.</w:t>
       </w:r>
     </w:p>
     <w:p>
@@ -1387,7 +1462,21 @@
         <w:rPr>
           <w:lang w:val="de-DE"/>
         </w:rPr>
-        <w:t>Bei aufgesattelter Wange stehen Antritts- und Austrittspfosten in der Treppe.</w:t>
+        <w:t>Neue Datei …_Pfosten_Bearbeitung.txt mit Taschen und Bohrungen je Pfostenfläche.</w:t>
+      </w:r>
+    </w:p>
+    <w:p>
+      <w:pPr>
+        <w:pStyle w:val="Heading3"/>
+        <w:rPr>
+          <w:lang w:val="de-DE"/>
+        </w:rPr>
+      </w:pPr>
+      <w:r>
+        <w:rPr>
+          <w:lang w:val="de-DE"/>
+        </w:rPr>
+        <w:t>Version 2.12.0 – Überlange Wangen in zwei Läufen</w:t>
       </w:r>
     </w:p>
     <w:p>
@@ -1405,21 +1494,7 @@
         <w:rPr>
           <w:lang w:val="de-DE"/>
         </w:rPr>
-        <w:t>Zwischenpfosten in der Feldmitte, wenn ein Feld länger als rail_mid (200 cm) ist.</w:t>
-      </w:r>
-    </w:p>
-    <w:p>
-      <w:pPr>
-        <w:pStyle w:val="Heading3"/>
-        <w:rPr>
-          <w:lang w:val="de-DE"/>
-        </w:rPr>
-      </w:pPr>
-      <w:r>
-        <w:rPr>
-          <w:lang w:val="de-DE"/>
-        </w:rPr>
-        <w:t>Version 2.10.0 – Stäbe rund oder quadratisch, Bohrungen im TCN</w:t>
+        <w:t>Teile länger als der Verfahrweg (mach_l, 3200 mm) werden in zwei Läufe geteilt: Lauf A im Feld N1 (Ende A am linken X-Anschlag, Kante 1 vorne), dann das Teil um 180° drehen, Lauf B im Feld N (Ende B am selben Anschlag, Kante 1 hinten).</w:t>
       </w:r>
     </w:p>
     <w:p>
@@ -1437,7 +1512,7 @@
         <w:rPr>
           <w:lang w:val="de-DE"/>
         </w:rPr>
-        <w:t>Stabform bal_shape (quadrat/rund) mit bal_d bzw. bal_dia; Bohrung Ø = Stabmaß.</w:t>
+        <w:t>Teilung zwischen den Bearbeitungen, Außenkontur überlappend (long_overlap), Haltestege im ersten Lauf (tab_n, tab_w, tab_h); Einrichtblatt in der Nacharbeit.</w:t>
       </w:r>
     </w:p>
     <w:p>
@@ -1455,7 +1530,7 @@
         <w:rPr>
           <w:lang w:val="de-DE"/>
         </w:rPr>
-        <w:t>Bohrungen im TCN: Trittstufen von oben, eingestemmte Wangen mit dem Bohraggregat oder nur markiert (drill_wange, drill_tool, hdrill_tool, drill_clear).</w:t>
+        <w:t>Wangen und Handläufe werden nie verschachtelt: jedes Teil hat einen eigenen Rohling (blank_margin), damit das Bohraggregat an die Kanten kommt.</w:t>
       </w:r>
     </w:p>
     <w:p>
@@ -1469,7 +1544,7 @@
         <w:rPr>
           <w:lang w:val="de-DE"/>
         </w:rPr>
-        <w:t>Version 2.9.0 – Geländer neu, Wangen stumpf gestoßen</w:t>
+        <w:t>Version 2.11.0 – Geländer-Korrekturen</w:t>
       </w:r>
     </w:p>
     <w:p>
@@ -1487,7 +1562,7 @@
         <w:rPr>
           <w:lang w:val="de-DE"/>
         </w:rPr>
-        <w:t>Pfosten am Antritt, Austritt und jedem Laufwechsel (newel_s), rechteckiger Handlauf von Pfosten zu Pfosten (rail_hh, Breite = Wangendicke), Stäbe dazwischen (bal_gap, bal_edge, bal_depth). post_every und post_s entfallen.</w:t>
+        <w:t>Stäbe sind oben lotrecht in den Handlauf gebohrt; der Handlauf endet genau an der Pfostenfläche.</w:t>
       </w:r>
     </w:p>
     <w:p>
@@ -1505,21 +1580,7 @@
         <w:rPr>
           <w:lang w:val="de-DE"/>
         </w:rPr>
-        <w:t>Wangenstöße ohne Gehrung (stumpf); eingestemmte Wangen enden an den Pfosten.</w:t>
-      </w:r>
-    </w:p>
-    <w:p>
-      <w:pPr>
-        <w:pStyle w:val="Heading3"/>
-        <w:rPr>
-          <w:lang w:val="de-DE"/>
-        </w:rPr>
-      </w:pPr>
-      <w:r>
-        <w:rPr>
-          <w:lang w:val="de-DE"/>
-        </w:rPr>
-        <w:t>Version 2.8.0 – Drachenstufe außermittig</w:t>
+        <w:t>Bei aufgesattelter Wange stehen Antritts- und Austrittspfosten in der Treppe.</w:t>
       </w:r>
     </w:p>
     <w:p>
@@ -1537,7 +1598,7 @@
         <w:rPr>
           <w:lang w:val="de-DE"/>
         </w:rPr>
-        <w:t>Die Ecke darf außermittig in der Drachenstufe liegen (kite_pos, kite_pos2), der kürzere Schenkel innen ist mindestens 2 cm lang; die Gehlinie bleibt dabei erhalten.</w:t>
+        <w:t>Zwischenpfosten in der Feldmitte, wenn ein Feld länger als rail_mid (200 cm) ist.</w:t>
       </w:r>
     </w:p>
     <w:p>
@@ -1551,7 +1612,7 @@
         <w:rPr>
           <w:lang w:val="de-DE"/>
         </w:rPr>
-        <w:t>Version 2.7.0 / 2.7.1 – Aufgesattelte Wangen 3D, Fräser automatisch</w:t>
+        <w:t>Version 2.10.0 – Stäbe rund oder quadratisch, Bohrungen im TCN</w:t>
       </w:r>
     </w:p>
     <w:p>
@@ -1569,7 +1630,7 @@
         <w:rPr>
           <w:lang w:val="de-DE"/>
         </w:rPr>
-        <w:t>Aufgesattelte Wangen: schräge, passgenaue Stöße; je Wange ein eigenes Programm mit Seitenaggregat für die Schrägen, optional Wenden (sat_mode, sat_wenden, sat_zstep, agg_*).</w:t>
+        <w:t>Stabform bal_shape (quadrat/rund) mit bal_d bzw. bal_dia; Bohrung Ø = Stabmaß.</w:t>
       </w:r>
     </w:p>
     <w:p>
@@ -1587,21 +1648,7 @@
         <w:rPr>
           <w:lang w:val="de-DE"/>
         </w:rPr>
-        <w:t>Fräser Außenkontur automatisch je Materialstärke (1300 bis 54 mm Tiefe, sonst 1004; 2200 nur bei Auswahl), nicht mehr mit dxf4tcn geteilt.</w:t>
-      </w:r>
-    </w:p>
-    <w:p>
-      <w:pPr>
-        <w:pStyle w:val="Heading2"/>
-        <w:rPr>
-          <w:lang w:val="de-DE"/>
-        </w:rPr>
-      </w:pPr>
-      <w:r>
-        <w:rPr>
-          <w:lang w:val="de-DE"/>
-        </w:rPr>
-        <w:t>Frühere Änderungen (bis Version 2.6.0)</w:t>
+        <w:t>Bohrungen im TCN: Trittstufen von oben, eingestemmte Wangen mit dem Bohraggregat oder nur markiert (drill_wange, drill_tool, hdrill_tool, drill_clear).</w:t>
       </w:r>
     </w:p>
     <w:p>
@@ -1615,7 +1662,7 @@
         <w:rPr>
           <w:lang w:val="de-DE"/>
         </w:rPr>
-        <w:t xml:space="preserve">Version 2.6.0 – Umschalten Raum ↔ Parameter (fehler.md Nr. 6)</w:t>
+        <w:t>Version 2.9.0 – Geländer neu, Wangen stumpf gestoßen</w:t>
       </w:r>
     </w:p>
     <w:p>
@@ -1633,20 +1680,7 @@
         <w:rPr>
           <w:lang w:val="de-DE"/>
         </w:rPr>
-        <w:t xml:space="preserve">Beim Umschalten der </w:t>
-      </w:r>
-      <w:r>
-        <w:rPr>
-          <w:i/>
-          <w:lang w:val="de-DE"/>
-        </w:rPr>
-        <w:t xml:space="preserve">Ermittlung</w:t>
-      </w:r>
-      <w:r>
-        <w:rPr>
-          <w:lang w:val="de-DE"/>
-        </w:rPr>
-        <w:t xml:space="preserve"> bleibt die Treppe exakt gleich (geprüft auf 0,01 cm). So lässt sich eine eingepasste Treppe anschließend über die Parameter feinjustieren – und umgekehrt eine frei geplante Treppe in einen passenden Raum übernehmen.</w:t>
+        <w:t>Pfosten am Antritt, Austritt und jedem Laufwechsel (newel_s), rechteckiger Handlauf von Pfosten zu Pfosten (rail_hh, Breite = Wangendicke), Stäbe dazwischen (bal_gap, bal_edge, bal_depth). post_every und post_s entfallen.</w:t>
       </w:r>
     </w:p>
     <w:p>
@@ -1662,42 +1696,23 @@
       </w:pPr>
       <w:r>
         <w:rPr>
-          <w:b/>
-          <w:lang w:val="de-DE"/>
-        </w:rPr>
-        <w:t xml:space="preserve">Raum → Parameter:</w:t>
-      </w:r>
-      <w:r>
-        <w:rPr>
-          <w:lang w:val="de-DE"/>
-        </w:rPr>
-        <w:t xml:space="preserve"> Die beim Einpassen gefundenen Werte werden in die Felder übernommen: Anzahl Steigungen, Auftritt, Laufbreite, Gehlinie, Steigungen je Lauf, Lage der Wendelung (</w:t>
-      </w:r>
-      <w:r>
-        <w:rPr>
-          <w:rStyle w:val="CodeChar"/>
-          <w:lang w:val="de-DE"/>
-        </w:rPr>
-        <w:t xml:space="preserve">m1</w:t>
-      </w:r>
-      <w:r>
-        <w:rPr>
-          <w:lang w:val="de-DE"/>
-        </w:rPr>
-        <w:t xml:space="preserve">/</w:t>
-      </w:r>
-      <w:r>
-        <w:rPr>
-          <w:rStyle w:val="CodeChar"/>
-          <w:lang w:val="de-DE"/>
-        </w:rPr>
-        <w:t xml:space="preserve">m2</w:t>
-      </w:r>
-      <w:r>
-        <w:rPr>
-          <w:lang w:val="de-DE"/>
-        </w:rPr>
-        <w:t xml:space="preserve">), Podestlänge, Podestverlängerungen und Austrittspodest. Gesamtbreite/-tiefe werden 0. Bei Wendeltreppen wird nur der Außendurchmesser übernommen.</w:t>
+          <w:lang w:val="de-DE"/>
+        </w:rPr>
+        <w:t>Wangenstöße ohne Gehrung (stumpf); eingestemmte Wangen enden an den Pfosten.</w:t>
+      </w:r>
+    </w:p>
+    <w:p>
+      <w:pPr>
+        <w:pStyle w:val="Heading3"/>
+        <w:rPr>
+          <w:lang w:val="de-DE"/>
+        </w:rPr>
+      </w:pPr>
+      <w:r>
+        <w:rPr>
+          <w:lang w:val="de-DE"/>
+        </w:rPr>
+        <w:t>Version 2.8.0 – Drachenstufe außermittig</w:t>
       </w:r>
     </w:p>
     <w:p>
@@ -1713,16 +1728,23 @@
       </w:pPr>
       <w:r>
         <w:rPr>
-          <w:b/>
-          <w:lang w:val="de-DE"/>
-        </w:rPr>
-        <w:t xml:space="preserve">Parameter → Raum:</w:t>
-      </w:r>
-      <w:r>
-        <w:rPr>
-          <w:lang w:val="de-DE"/>
-        </w:rPr>
-        <w:t xml:space="preserve"> Raumlänge und -breite ergeben sich aus dem Umriss der Treppe (inkl. Wangen) plus Spiel an den vorhandenen Wänden; Wandwinkel 90°, Antritt fest. Ein vorhandenes Treppenloch wird an den Austritt gelegt (Maße bleiben soweit möglich). Hat die Treppe ein Austrittspodest – oder bei U/dreiläufig eine Podestverlängerung nach der letzten Wendung –, wird automatisch ein Treppenloch angelegt.</w:t>
+          <w:lang w:val="de-DE"/>
+        </w:rPr>
+        <w:t>Die Ecke darf außermittig in der Drachenstufe liegen (kite_pos, kite_pos2), der kürzere Schenkel innen ist mindestens 2 cm lang; die Gehlinie bleibt dabei erhalten.</w:t>
+      </w:r>
+    </w:p>
+    <w:p>
+      <w:pPr>
+        <w:pStyle w:val="Heading3"/>
+        <w:rPr>
+          <w:lang w:val="de-DE"/>
+        </w:rPr>
+      </w:pPr>
+      <w:r>
+        <w:rPr>
+          <w:lang w:val="de-DE"/>
+        </w:rPr>
+        <w:t>Version 2.7.0 / 2.7.1 – Aufgesattelte Wangen 3D, Fräser automatisch</w:t>
       </w:r>
     </w:p>
     <w:p>
@@ -1740,7 +1762,7 @@
         <w:rPr>
           <w:lang w:val="de-DE"/>
         </w:rPr>
-        <w:t xml:space="preserve">Felder, die vorher auf „automatisch“ (0) standen, bleiben automatisch, wenn sich die Treppe dadurch nicht ändert. Wird ohne Änderung zurückgeschaltet, kommen die vorherigen Werte exakt wieder.</w:t>
+        <w:t>Aufgesattelte Wangen: schräge, passgenaue Stöße; je Wange ein eigenes Programm mit Seitenaggregat für die Schrägen, optional Wenden (sat_mode, sat_wenden, sat_zstep, agg_*).</w:t>
       </w:r>
     </w:p>
     <w:p>
@@ -1758,7 +1780,35 @@
         <w:rPr>
           <w:lang w:val="de-DE"/>
         </w:rPr>
-        <w:t xml:space="preserve">Die Statuszeile meldet „Treppe unverändert“ bzw. die Abweichung in cm. Beim Bearbeiten wird die Komponente so verschoben, dass die Treppe im Modell an ihrer Stelle bleibt (der Ursprung liegt im Raum-Modus in der vorderen linken Raumecke, sonst am Antritt).</w:t>
+        <w:t>Fräser Außenkontur automatisch je Materialstärke (1300 bis 54 mm Tiefe, sonst 1004; 2200 nur bei Auswahl), nicht mehr mit dxf4tcn geteilt.</w:t>
+      </w:r>
+    </w:p>
+    <w:p>
+      <w:pPr>
+        <w:pStyle w:val="Heading2"/>
+        <w:rPr>
+          <w:lang w:val="de-DE"/>
+        </w:rPr>
+      </w:pPr>
+      <w:r>
+        <w:rPr>
+          <w:lang w:val="de-DE"/>
+        </w:rPr>
+        <w:t>Frühere Änderungen (bis Version 2.6.0)</w:t>
+      </w:r>
+    </w:p>
+    <w:p>
+      <w:pPr>
+        <w:pStyle w:val="Heading3"/>
+        <w:rPr>
+          <w:lang w:val="de-DE"/>
+        </w:rPr>
+      </w:pPr>
+      <w:r>
+        <w:rPr>
+          <w:lang w:val="de-DE"/>
+        </w:rPr>
+        <w:t xml:space="preserve">Version 2.6.0 – Umschalten Raum ↔ Parameter (fehler.md Nr. 6)</w:t>
       </w:r>
     </w:p>
     <w:p>
@@ -1776,72 +1826,20 @@
         <w:rPr>
           <w:lang w:val="de-DE"/>
         </w:rPr>
-        <w:t xml:space="preserve">Neue Parameter bei „Treppe aus den Parametern berechnen“: </w:t>
-      </w:r>
-      <w:r>
-        <w:rPr>
-          <w:rStyle w:val="CodeChar"/>
-          <w:lang w:val="de-DE"/>
-        </w:rPr>
-        <w:t xml:space="preserve">pod1_vor</w:t>
-      </w:r>
-      <w:r>
-        <w:rPr>
-          <w:lang w:val="de-DE"/>
-        </w:rPr>
-        <w:t xml:space="preserve">, </w:t>
-      </w:r>
-      <w:r>
-        <w:rPr>
-          <w:rStyle w:val="CodeChar"/>
-          <w:lang w:val="de-DE"/>
-        </w:rPr>
-        <w:t xml:space="preserve">pod1_nach</w:t>
-      </w:r>
-      <w:r>
-        <w:rPr>
-          <w:lang w:val="de-DE"/>
-        </w:rPr>
-        <w:t xml:space="preserve">, </w:t>
-      </w:r>
-      <w:r>
-        <w:rPr>
-          <w:rStyle w:val="CodeChar"/>
-          <w:lang w:val="de-DE"/>
-        </w:rPr>
-        <w:t xml:space="preserve">pod2_vor</w:t>
-      </w:r>
-      <w:r>
-        <w:rPr>
-          <w:lang w:val="de-DE"/>
-        </w:rPr>
-        <w:t xml:space="preserve">, </w:t>
-      </w:r>
-      <w:r>
-        <w:rPr>
-          <w:rStyle w:val="CodeChar"/>
-          <w:lang w:val="de-DE"/>
-        </w:rPr>
-        <w:t xml:space="preserve">pod2_nach</w:t>
-      </w:r>
-      <w:r>
-        <w:rPr>
-          <w:lang w:val="de-DE"/>
-        </w:rPr>
-        <w:t xml:space="preserve"> (Podestverlängerung vor/nach der Wendung) und </w:t>
-      </w:r>
-      <w:r>
-        <w:rPr>
-          <w:rStyle w:val="CodeChar"/>
-          <w:lang w:val="de-DE"/>
-        </w:rPr>
-        <w:t xml:space="preserve">exit_land</w:t>
-      </w:r>
-      <w:r>
-        <w:rPr>
-          <w:lang w:val="de-DE"/>
-        </w:rPr>
-        <w:t xml:space="preserve"> (Austrittspodest) – siehe Grundriss.</w:t>
+        <w:t xml:space="preserve">Beim Umschalten der </w:t>
+      </w:r>
+      <w:r>
+        <w:rPr>
+          <w:i/>
+          <w:lang w:val="de-DE"/>
+        </w:rPr>
+        <w:t xml:space="preserve">Ermittlung</w:t>
+      </w:r>
+      <w:r>
+        <w:rPr>
+          <w:lang w:val="de-DE"/>
+        </w:rPr>
+        <w:t xml:space="preserve"> bleibt die Treppe exakt gleich (geprüft auf 0,01 cm). So lässt sich eine eingepasste Treppe anschließend über die Parameter feinjustieren – und umgekehrt eine frei geplante Treppe in einen passenden Raum übernehmen.</w:t>
       </w:r>
     </w:p>
     <w:p>
@@ -1857,9 +1855,42 @@
       </w:pPr>
       <w:r>
         <w:rPr>
-          <w:lang w:val="de-DE"/>
-        </w:rPr>
-        <w:t xml:space="preserve">Korrektur: Sehr kurze Wangenbretter (z. B. eine kleine Podestverlängerung hinter einer Ecke) werden mit dem Brett in gleicher Flucht vereinigt; vorher überschnitten sich Gehrung und Brettende (Körper nicht geschlossen). Dreiläufige Podesttreppen im Raum bekommen dadurch teils eine schmalere Wange.</w:t>
+          <w:b/>
+          <w:lang w:val="de-DE"/>
+        </w:rPr>
+        <w:t xml:space="preserve">Raum → Parameter:</w:t>
+      </w:r>
+      <w:r>
+        <w:rPr>
+          <w:lang w:val="de-DE"/>
+        </w:rPr>
+        <w:t xml:space="preserve"> Die beim Einpassen gefundenen Werte werden in die Felder übernommen: Anzahl Steigungen, Auftritt, Laufbreite, Gehlinie, Steigungen je Lauf, Lage der Wendelung (</w:t>
+      </w:r>
+      <w:r>
+        <w:rPr>
+          <w:rStyle w:val="CodeChar"/>
+          <w:lang w:val="de-DE"/>
+        </w:rPr>
+        <w:t xml:space="preserve">m1</w:t>
+      </w:r>
+      <w:r>
+        <w:rPr>
+          <w:lang w:val="de-DE"/>
+        </w:rPr>
+        <w:t xml:space="preserve">/</w:t>
+      </w:r>
+      <w:r>
+        <w:rPr>
+          <w:rStyle w:val="CodeChar"/>
+          <w:lang w:val="de-DE"/>
+        </w:rPr>
+        <w:t xml:space="preserve">m2</w:t>
+      </w:r>
+      <w:r>
+        <w:rPr>
+          <w:lang w:val="de-DE"/>
+        </w:rPr>
+        <w:t xml:space="preserve">), Podestlänge, Podestverlängerungen und Austrittspodest. Gesamtbreite/-tiefe werden 0. Bei Wendeltreppen wird nur der Außendurchmesser übernommen.</w:t>
       </w:r>
     </w:p>
     <w:p>
@@ -1875,23 +1906,16 @@
       </w:pPr>
       <w:r>
         <w:rPr>
-          <w:lang w:val="de-DE"/>
-        </w:rPr>
-        <w:t xml:space="preserve">Grenze: Schräge Wände (≠ 90°) lassen sich ohne Raum nicht nachbilden – dann meldet der Dialog die Abweichung.</w:t>
-      </w:r>
-    </w:p>
-    <w:p>
-      <w:pPr>
-        <w:pStyle w:val="Heading3"/>
-        <w:rPr>
-          <w:lang w:val="de-DE"/>
-        </w:rPr>
-      </w:pPr>
-      <w:r>
-        <w:rPr>
-          <w:lang w:val="de-DE"/>
-        </w:rPr>
-        <w:t xml:space="preserve">Version 2.5.0 – Austrittspodest am Treppenloch (Nr. 5)</w:t>
+          <w:b/>
+          <w:lang w:val="de-DE"/>
+        </w:rPr>
+        <w:t xml:space="preserve">Parameter → Raum:</w:t>
+      </w:r>
+      <w:r>
+        <w:rPr>
+          <w:lang w:val="de-DE"/>
+        </w:rPr>
+        <w:t xml:space="preserve"> Raumlänge und -breite ergeben sich aus dem Umriss der Treppe (inkl. Wangen) plus Spiel an den vorhandenen Wänden; Wandwinkel 90°, Antritt fest. Ein vorhandenes Treppenloch wird an den Austritt gelegt (Maße bleiben soweit möglich). Hat die Treppe ein Austrittspodest – oder bei U/dreiläufig eine Podestverlängerung nach der letzten Wendung –, wird automatisch ein Treppenloch angelegt.</w:t>
       </w:r>
     </w:p>
     <w:p>
@@ -1909,20 +1933,7 @@
         <w:rPr>
           <w:lang w:val="de-DE"/>
         </w:rPr>
-        <w:t xml:space="preserve">Neuer Parameter </w:t>
-      </w:r>
-      <w:r>
-        <w:rPr>
-          <w:rStyle w:val="CodeChar"/>
-          <w:lang w:val="de-DE"/>
-        </w:rPr>
-        <w:t xml:space="preserve">loch_gap</w:t>
-      </w:r>
-      <w:r>
-        <w:rPr>
-          <w:lang w:val="de-DE"/>
-        </w:rPr>
-        <w:t xml:space="preserve"> (Abstand des Austritts vom Rand des Treppenlochs), Standard 0 = Austrittskante an der Lochkante wie bisher.</w:t>
+        <w:t xml:space="preserve">Felder, die vorher auf „automatisch“ (0) standen, bleiben automatisch, wenn sich die Treppe dadurch nicht ändert. Wird ohne Änderung zurückgeschaltet, kommen die vorherigen Werte exakt wieder.</w:t>
       </w:r>
     </w:p>
     <w:p>
@@ -1940,7 +1951,7 @@
         <w:rPr>
           <w:lang w:val="de-DE"/>
         </w:rPr>
-        <w:t xml:space="preserve">&gt; 0: die letzte Steigung endet um dieses Maß vor der Lochkante (rechtwinklig zur Kante gemessen). Dazwischen entsteht ein Austrittspodest auf Höhe der oberen Decke – mit Podestplatte, Setzstufe, Wangen (eingestemmt oder aufgesattelt), Geländer, Holm- bzw. Massivausführung und CNC-Teil.</w:t>
+        <w:t xml:space="preserve">Die Statuszeile meldet „Treppe unverändert“ bzw. die Abweichung in cm. Beim Bearbeiten wird die Komponente so verschoben, dass die Treppe im Modell an ihrer Stelle bleibt (der Ursprung liegt im Raum-Modus in der vorderen linken Raumecke, sonst am Antritt).</w:t>
       </w:r>
     </w:p>
     <w:p>
@@ -1958,7 +1969,72 @@
         <w:rPr>
           <w:lang w:val="de-DE"/>
         </w:rPr>
-        <w:t xml:space="preserve">Das Maß muss mindestens 10 cm kleiner sein als das Treppenloch in dieser Richtung. Nicht für Wendeltreppen.</w:t>
+        <w:t xml:space="preserve">Neue Parameter bei „Treppe aus den Parametern berechnen“: </w:t>
+      </w:r>
+      <w:r>
+        <w:rPr>
+          <w:rStyle w:val="CodeChar"/>
+          <w:lang w:val="de-DE"/>
+        </w:rPr>
+        <w:t xml:space="preserve">pod1_vor</w:t>
+      </w:r>
+      <w:r>
+        <w:rPr>
+          <w:lang w:val="de-DE"/>
+        </w:rPr>
+        <w:t xml:space="preserve">, </w:t>
+      </w:r>
+      <w:r>
+        <w:rPr>
+          <w:rStyle w:val="CodeChar"/>
+          <w:lang w:val="de-DE"/>
+        </w:rPr>
+        <w:t xml:space="preserve">pod1_nach</w:t>
+      </w:r>
+      <w:r>
+        <w:rPr>
+          <w:lang w:val="de-DE"/>
+        </w:rPr>
+        <w:t xml:space="preserve">, </w:t>
+      </w:r>
+      <w:r>
+        <w:rPr>
+          <w:rStyle w:val="CodeChar"/>
+          <w:lang w:val="de-DE"/>
+        </w:rPr>
+        <w:t xml:space="preserve">pod2_vor</w:t>
+      </w:r>
+      <w:r>
+        <w:rPr>
+          <w:lang w:val="de-DE"/>
+        </w:rPr>
+        <w:t xml:space="preserve">, </w:t>
+      </w:r>
+      <w:r>
+        <w:rPr>
+          <w:rStyle w:val="CodeChar"/>
+          <w:lang w:val="de-DE"/>
+        </w:rPr>
+        <w:t xml:space="preserve">pod2_nach</w:t>
+      </w:r>
+      <w:r>
+        <w:rPr>
+          <w:lang w:val="de-DE"/>
+        </w:rPr>
+        <w:t xml:space="preserve"> (Podestverlängerung vor/nach der Wendung) und </w:t>
+      </w:r>
+      <w:r>
+        <w:rPr>
+          <w:rStyle w:val="CodeChar"/>
+          <w:lang w:val="de-DE"/>
+        </w:rPr>
+        <w:t xml:space="preserve">exit_land</w:t>
+      </w:r>
+      <w:r>
+        <w:rPr>
+          <w:lang w:val="de-DE"/>
+        </w:rPr>
+        <w:t xml:space="preserve"> (Austrittspodest) – siehe Grundriss.</w:t>
       </w:r>
     </w:p>
     <w:p>
@@ -1976,21 +2052,7 @@
         <w:rPr>
           <w:lang w:val="de-DE"/>
         </w:rPr>
-        <w:t xml:space="preserve">Info: „Austritt an: … cm vor der Kante des Treppenlochs“ und „Austrittspodest (auf Deckenhöhe): Tiefe/Breite“. Die Kopffreiheit wird nur über echten Stufen geprüft.</w:t>
-      </w:r>
-    </w:p>
-    <w:p>
-      <w:pPr>
-        <w:pStyle w:val="Heading3"/>
-        <w:rPr>
-          <w:lang w:val="de-DE"/>
-        </w:rPr>
-      </w:pPr>
-      <w:r>
-        <w:rPr>
-          <w:lang w:val="de-DE"/>
-        </w:rPr>
-        <w:t xml:space="preserve">Version 2.4.0 – Antritt außerhalb des Raums (Nr. 4)</w:t>
+        <w:t xml:space="preserve">Korrektur: Sehr kurze Wangenbretter (z. B. eine kleine Podestverlängerung hinter einer Ecke) werden mit dem Brett in gleicher Flucht vereinigt; vorher überschnitten sich Gehrung und Brettende (Körper nicht geschlossen). Dreiläufige Podesttreppen im Raum bekommen dadurch teils eine schmalere Wange.</w:t>
       </w:r>
     </w:p>
     <w:p>
@@ -2006,16 +2068,23 @@
       </w:pPr>
       <w:r>
         <w:rPr>
-          <w:rStyle w:val="CodeChar"/>
-          <w:lang w:val="de-DE"/>
-        </w:rPr>
-        <w:t xml:space="preserve">antritt_l</w:t>
-      </w:r>
-      <w:r>
-        <w:rPr>
-          <w:lang w:val="de-DE"/>
-        </w:rPr>
-        <w:t xml:space="preserve"> darf größer als die Raumlänge sein: die ersten Stufen liegen dann vor dem Raumende bzw. außerhalb des Treppenlochs. Die Seitenwände gelten dort als verlängert.</w:t>
+          <w:lang w:val="de-DE"/>
+        </w:rPr>
+        <w:t xml:space="preserve">Grenze: Schräge Wände (≠ 90°) lassen sich ohne Raum nicht nachbilden – dann meldet der Dialog die Abweichung.</w:t>
+      </w:r>
+    </w:p>
+    <w:p>
+      <w:pPr>
+        <w:pStyle w:val="Heading3"/>
+        <w:rPr>
+          <w:lang w:val="de-DE"/>
+        </w:rPr>
+      </w:pPr>
+      <w:r>
+        <w:rPr>
+          <w:lang w:val="de-DE"/>
+        </w:rPr>
+        <w:t xml:space="preserve">Version 2.5.0 – Austrittspodest am Treppenloch (Nr. 5)</w:t>
       </w:r>
     </w:p>
     <w:p>
@@ -2033,7 +2102,20 @@
         <w:rPr>
           <w:lang w:val="de-DE"/>
         </w:rPr>
-        <w:t xml:space="preserve">Der Austritt muss weiterhin im Raum bzw. am Treppenloch liegen – sonst Meldung „Austritt liegt außerhalb der Raumlänge“ (betrifft vor allem U/dreiläufig, deren letzter Lauf nach vorn läuft).</w:t>
+        <w:t xml:space="preserve">Neuer Parameter </w:t>
+      </w:r>
+      <w:r>
+        <w:rPr>
+          <w:rStyle w:val="CodeChar"/>
+          <w:lang w:val="de-DE"/>
+        </w:rPr>
+        <w:t xml:space="preserve">loch_gap</w:t>
+      </w:r>
+      <w:r>
+        <w:rPr>
+          <w:lang w:val="de-DE"/>
+        </w:rPr>
+        <w:t xml:space="preserve"> (Abstand des Austritts vom Rand des Treppenlochs), Standard 0 = Austrittskante an der Lochkante wie bisher.</w:t>
       </w:r>
     </w:p>
     <w:p>
@@ -2051,21 +2133,7 @@
         <w:rPr>
           <w:lang w:val="de-DE"/>
         </w:rPr>
-        <w:t xml:space="preserve">Neue Info „Treppe ragt über das Raumende (Antritt) hinaus: … cm“.</w:t>
-      </w:r>
-    </w:p>
-    <w:p>
-      <w:pPr>
-        <w:pStyle w:val="Heading3"/>
-        <w:rPr>
-          <w:lang w:val="de-DE"/>
-        </w:rPr>
-      </w:pPr>
-      <w:r>
-        <w:rPr>
-          <w:lang w:val="de-DE"/>
-        </w:rPr>
-        <w:t xml:space="preserve">Version 2.3.0 – Wangen und Grundmaß (Nr. 1–3)</w:t>
+        <w:t xml:space="preserve">&gt; 0: die letzte Steigung endet um dieses Maß vor der Lochkante (rechtwinklig zur Kante gemessen). Dazwischen entsteht ein Austrittspodest auf Höhe der oberen Decke – mit Podestplatte, Setzstufe, Wangen (eingestemmt oder aufgesattelt), Geländer, Holm- bzw. Massivausführung und CNC-Teil.</w:t>
       </w:r>
     </w:p>
     <w:p>
@@ -2081,16 +2149,9 @@
       </w:pPr>
       <w:r>
         <w:rPr>
-          <w:b/>
-          <w:lang w:val="de-DE"/>
-        </w:rPr>
-        <w:t xml:space="preserve">Nr. 1:</w:t>
-      </w:r>
-      <w:r>
-        <w:rPr>
-          <w:lang w:val="de-DE"/>
-        </w:rPr>
-        <w:t xml:space="preserve"> Die Wangenform „geschwungen“ gilt jetzt auch für aufgesattelte Wangen: Unterkante als knickfreie Kurve je Lauf, an jeder Ausklinkung mindestens die Restbreite.</w:t>
+          <w:lang w:val="de-DE"/>
+        </w:rPr>
+        <w:t xml:space="preserve">Das Maß muss mindestens 10 cm kleiner sein als das Treppenloch in dieser Richtung. Nicht für Wendeltreppen.</w:t>
       </w:r>
     </w:p>
     <w:p>
@@ -2106,16 +2167,23 @@
       </w:pPr>
       <w:r>
         <w:rPr>
-          <w:b/>
-          <w:lang w:val="de-DE"/>
-        </w:rPr>
-        <w:t xml:space="preserve">Nr. 2:</w:t>
-      </w:r>
-      <w:r>
-        <w:rPr>
-          <w:lang w:val="de-DE"/>
-        </w:rPr>
-        <w:t xml:space="preserve"> Eingestemmte Wangen mit konstanter Breite sind an allen Stößen (Gehrungen im Wendelbereich, Podeste) oben und unten bündig. Die Oberkante ist je Lauf stetig (an Podesten mit Kröpfung), die Unterkante liegt parallel im Abstand der Brettbreite. Die automatische Wangenbreite ändert sich dadurch, z. B. L gewendelt 42,5 → 51,5 cm, U mit Podest 30,5 → 27,5 cm.</w:t>
+          <w:lang w:val="de-DE"/>
+        </w:rPr>
+        <w:t xml:space="preserve">Info: „Austritt an: … cm vor der Kante des Treppenlochs“ und „Austrittspodest (auf Deckenhöhe): Tiefe/Breite“. Die Kopffreiheit wird nur über echten Stufen geprüft.</w:t>
+      </w:r>
+    </w:p>
+    <w:p>
+      <w:pPr>
+        <w:pStyle w:val="Heading3"/>
+        <w:rPr>
+          <w:lang w:val="de-DE"/>
+        </w:rPr>
+      </w:pPr>
+      <w:r>
+        <w:rPr>
+          <w:lang w:val="de-DE"/>
+        </w:rPr>
+        <w:t xml:space="preserve">Version 2.4.0 – Antritt außerhalb des Raums (Nr. 4)</w:t>
       </w:r>
     </w:p>
     <w:p>
@@ -2131,56 +2199,16 @@
       </w:pPr>
       <w:r>
         <w:rPr>
-          <w:b/>
-          <w:lang w:val="de-DE"/>
-        </w:rPr>
-        <w:t xml:space="preserve">Nr. 3:</w:t>
-      </w:r>
-      <w:r>
-        <w:rPr>
-          <w:lang w:val="de-DE"/>
-        </w:rPr>
-        <w:t xml:space="preserve"> Neue Parameter </w:t>
-      </w:r>
-      <w:r>
-        <w:rPr>
           <w:rStyle w:val="CodeChar"/>
           <w:lang w:val="de-DE"/>
         </w:rPr>
-        <w:t xml:space="preserve">total_w</w:t>
-      </w:r>
-      <w:r>
-        <w:rPr>
-          <w:lang w:val="de-DE"/>
-        </w:rPr>
-        <w:t xml:space="preserve"> (Gesamtbreite) und </w:t>
-      </w:r>
-      <w:r>
-        <w:rPr>
-          <w:rStyle w:val="CodeChar"/>
-          <w:lang w:val="de-DE"/>
-        </w:rPr>
-        <w:t xml:space="preserve">total_l</w:t>
-      </w:r>
-      <w:r>
-        <w:rPr>
-          <w:lang w:val="de-DE"/>
-        </w:rPr>
-        <w:t xml:space="preserve"> (Gesamttiefe) bei freier Planung. Die Treppe wird darin wie in einen Raum mit drei Wänden ohne Spiel eingepasst; 0 = Maß ergibt sich wie bisher aus den Parametern. Ursprung = vordere linke Ecke des Grundmaßes, die Vorschau zeigt es gestrichelt.</w:t>
-      </w:r>
-    </w:p>
-    <w:p>
-      <w:pPr>
-        <w:pStyle w:val="Heading3"/>
-        <w:rPr>
-          <w:lang w:val="de-DE"/>
-        </w:rPr>
-      </w:pPr>
-      <w:r>
-        <w:rPr>
-          <w:lang w:val="de-DE"/>
-        </w:rPr>
-        <w:t xml:space="preserve">Version 2.0.0 – Update ohne Deinstallation und Neustart</w:t>
+        <w:t xml:space="preserve">antritt_l</w:t>
+      </w:r>
+      <w:r>
+        <w:rPr>
+          <w:lang w:val="de-DE"/>
+        </w:rPr>
+        <w:t xml:space="preserve"> darf größer als die Raumlänge sein: die ersten Stufen liegen dann vor dem Raumende bzw. außerhalb des Treppenlochs. Die Seitenwände gelten dort als verlängert.</w:t>
       </w:r>
     </w:p>
     <w:p>
@@ -2198,20 +2226,7 @@
         <w:rPr>
           <w:lang w:val="de-DE"/>
         </w:rPr>
-        <w:t xml:space="preserve">Eine neue .rbz wird einfach über die alte installiert – ohne Deinstallation. Das Plugin lädt sich danach selbst neu; zusätzlich gibt es </w:t>
-      </w:r>
-      <w:r>
-        <w:rPr>
-          <w:i/>
-          <w:lang w:val="de-DE"/>
-        </w:rPr>
-        <w:t xml:space="preserve">Erweiterungen → Treppenbau → Treppenbau neu laden</w:t>
-      </w:r>
-      <w:r>
-        <w:rPr>
-          <w:lang w:val="de-DE"/>
-        </w:rPr>
-        <w:t xml:space="preserve">.</w:t>
+        <w:t xml:space="preserve">Der Austritt muss weiterhin im Raum bzw. am Treppenloch liegen – sonst Meldung „Austritt liegt außerhalb der Raumlänge“ (betrifft vor allem U/dreiläufig, deren letzter Lauf nach vorn läuft).</w:t>
       </w:r>
     </w:p>
     <w:p>
@@ -2229,7 +2244,21 @@
         <w:rPr>
           <w:lang w:val="de-DE"/>
         </w:rPr>
-        <w:t xml:space="preserve">Neue Menüpunkte oder Schaltflächen erscheinen erst nach einem Neustart. Die Installation von 2.0.0 selbst brauchte einmalig einen Neustart.</w:t>
+        <w:t xml:space="preserve">Neue Info „Treppe ragt über das Raumende (Antritt) hinaus: … cm“.</w:t>
+      </w:r>
+    </w:p>
+    <w:p>
+      <w:pPr>
+        <w:pStyle w:val="Heading3"/>
+        <w:rPr>
+          <w:lang w:val="de-DE"/>
+        </w:rPr>
+      </w:pPr>
+      <w:r>
+        <w:rPr>
+          <w:lang w:val="de-DE"/>
+        </w:rPr>
+        <w:t xml:space="preserve">Version 2.3.0 – Wangen und Grundmaß (Nr. 1–3)</w:t>
       </w:r>
     </w:p>
     <w:p>
@@ -2245,23 +2274,16 @@
       </w:pPr>
       <w:r>
         <w:rPr>
-          <w:lang w:val="de-DE"/>
-        </w:rPr>
-        <w:t xml:space="preserve">Voraussetzung ist tatsächlich SketchUp 2018 oder neuer (Ruby 2.4).</w:t>
-      </w:r>
-    </w:p>
-    <w:p>
-      <w:pPr>
-        <w:pStyle w:val="Heading3"/>
-        <w:rPr>
-          <w:lang w:val="de-DE"/>
-        </w:rPr>
-      </w:pPr>
-      <w:r>
-        <w:rPr>
-          <w:lang w:val="de-DE"/>
-        </w:rPr>
-        <w:t xml:space="preserve">Version 1.5.3 – Aufgesattelte Wange an Ecken</w:t>
+          <w:b/>
+          <w:lang w:val="de-DE"/>
+        </w:rPr>
+        <w:t xml:space="preserve">Nr. 1:</w:t>
+      </w:r>
+      <w:r>
+        <w:rPr>
+          <w:lang w:val="de-DE"/>
+        </w:rPr>
+        <w:t xml:space="preserve"> Die Wangenform „geschwungen“ gilt jetzt auch für aufgesattelte Wangen: Unterkante als knickfreie Kurve je Lauf, an jeder Ausklinkung mindestens die Restbreite.</w:t>
       </w:r>
     </w:p>
     <w:p>
@@ -2277,11 +2299,900 @@
       </w:pPr>
       <w:r>
         <w:rPr>
+          <w:b/>
+          <w:lang w:val="de-DE"/>
+        </w:rPr>
+        <w:t xml:space="preserve">Nr. 2:</w:t>
+      </w:r>
+      <w:r>
+        <w:rPr>
+          <w:lang w:val="de-DE"/>
+        </w:rPr>
+        <w:t xml:space="preserve"> Eingestemmte Wangen mit konstanter Breite sind an allen Stößen (Gehrungen im Wendelbereich, Podeste) oben und unten bündig. Die Oberkante ist je Lauf stetig (an Podesten mit Kröpfung), die Unterkante liegt parallel im Abstand der Brettbreite. Die automatische Wangenbreite ändert sich dadurch, z. B. L gewendelt 42,5 → 51,5 cm, U mit Podest 30,5 → 27,5 cm.</w:t>
+      </w:r>
+    </w:p>
+    <w:p>
+      <w:pPr>
+        <w:pStyle w:val="ListParagraph"/>
+        <w:numPr>
+          <w:ilvl w:val="0"/>
+          <w:numId w:val="2"/>
+        </w:numPr>
+        <w:rPr>
+          <w:lang w:val="de-DE"/>
+        </w:rPr>
+      </w:pPr>
+      <w:r>
+        <w:rPr>
+          <w:b/>
+          <w:lang w:val="de-DE"/>
+        </w:rPr>
+        <w:t xml:space="preserve">Nr. 3:</w:t>
+      </w:r>
+      <w:r>
+        <w:rPr>
+          <w:lang w:val="de-DE"/>
+        </w:rPr>
+        <w:t xml:space="preserve"> Neue Parameter </w:t>
+      </w:r>
+      <w:r>
+        <w:rPr>
+          <w:rStyle w:val="CodeChar"/>
+          <w:lang w:val="de-DE"/>
+        </w:rPr>
+        <w:t xml:space="preserve">total_w</w:t>
+      </w:r>
+      <w:r>
+        <w:rPr>
+          <w:lang w:val="de-DE"/>
+        </w:rPr>
+        <w:t xml:space="preserve"> (Gesamtbreite) und </w:t>
+      </w:r>
+      <w:r>
+        <w:rPr>
+          <w:rStyle w:val="CodeChar"/>
+          <w:lang w:val="de-DE"/>
+        </w:rPr>
+        <w:t xml:space="preserve">total_l</w:t>
+      </w:r>
+      <w:r>
+        <w:rPr>
+          <w:lang w:val="de-DE"/>
+        </w:rPr>
+        <w:t xml:space="preserve"> (Gesamttiefe) bei freier Planung. Die Treppe wird darin wie in einen Raum mit drei Wänden ohne Spiel eingepasst; 0 = Maß ergibt sich wie bisher aus den Parametern. Ursprung = vordere linke Ecke des Grundmaßes, die Vorschau zeigt es gestrichelt.</w:t>
+      </w:r>
+    </w:p>
+    <w:p>
+      <w:pPr>
+        <w:pStyle w:val="Heading3"/>
+        <w:rPr>
+          <w:lang w:val="de-DE"/>
+        </w:rPr>
+      </w:pPr>
+      <w:r>
+        <w:rPr>
+          <w:lang w:val="de-DE"/>
+        </w:rPr>
+        <w:t xml:space="preserve">Version 2.0.0 – Update ohne Deinstallation und Neustart</w:t>
+      </w:r>
+    </w:p>
+    <w:p>
+      <w:pPr>
+        <w:pStyle w:val="ListParagraph"/>
+        <w:numPr>
+          <w:ilvl w:val="0"/>
+          <w:numId w:val="2"/>
+        </w:numPr>
+        <w:rPr>
+          <w:lang w:val="de-DE"/>
+        </w:rPr>
+      </w:pPr>
+      <w:r>
+        <w:rPr>
+          <w:lang w:val="de-DE"/>
+        </w:rPr>
+        <w:t xml:space="preserve">Eine neue .rbz wird einfach über die alte installiert – ohne Deinstallation. Das Plugin lädt sich danach selbst neu; zusätzlich gibt es </w:t>
+      </w:r>
+      <w:r>
+        <w:rPr>
+          <w:i/>
+          <w:lang w:val="de-DE"/>
+        </w:rPr>
+        <w:t xml:space="preserve">Erweiterungen → Treppenbau → Treppenbau neu laden</w:t>
+      </w:r>
+      <w:r>
+        <w:rPr>
+          <w:lang w:val="de-DE"/>
+        </w:rPr>
+        <w:t xml:space="preserve">.</w:t>
+      </w:r>
+    </w:p>
+    <w:p>
+      <w:pPr>
+        <w:pStyle w:val="ListParagraph"/>
+        <w:numPr>
+          <w:ilvl w:val="0"/>
+          <w:numId w:val="2"/>
+        </w:numPr>
+        <w:rPr>
+          <w:lang w:val="de-DE"/>
+        </w:rPr>
+      </w:pPr>
+      <w:r>
+        <w:rPr>
+          <w:lang w:val="de-DE"/>
+        </w:rPr>
+        <w:t xml:space="preserve">Neue Menüpunkte oder Schaltflächen erscheinen erst nach einem Neustart. Die Installation von 2.0.0 selbst brauchte einmalig einen Neustart.</w:t>
+      </w:r>
+    </w:p>
+    <w:p>
+      <w:pPr>
+        <w:pStyle w:val="ListParagraph"/>
+        <w:numPr>
+          <w:ilvl w:val="0"/>
+          <w:numId w:val="2"/>
+        </w:numPr>
+        <w:rPr>
+          <w:lang w:val="de-DE"/>
+        </w:rPr>
+      </w:pPr>
+      <w:r>
+        <w:rPr>
+          <w:lang w:val="de-DE"/>
+        </w:rPr>
+        <w:t xml:space="preserve">Voraussetzung ist tatsächlich SketchUp 2018 oder neuer (Ruby 2.4).</w:t>
+      </w:r>
+    </w:p>
+    <w:p>
+      <w:pPr>
+        <w:pStyle w:val="Heading3"/>
+        <w:rPr>
+          <w:lang w:val="de-DE"/>
+        </w:rPr>
+      </w:pPr>
+      <w:r>
+        <w:rPr>
+          <w:lang w:val="de-DE"/>
+        </w:rPr>
+        <w:t xml:space="preserve">Version 1.5.3 – Aufgesattelte Wange an Ecken</w:t>
+      </w:r>
+    </w:p>
+    <w:p>
+      <w:pPr>
+        <w:pStyle w:val="ListParagraph"/>
+        <w:numPr>
+          <w:ilvl w:val="0"/>
+          <w:numId w:val="2"/>
+        </w:numPr>
+        <w:rPr>
+          <w:lang w:val="de-DE"/>
+        </w:rPr>
+      </w:pPr>
+      <w:r>
+        <w:rPr>
           <w:lang w:val="de-DE"/>
         </w:rPr>
         <w:t xml:space="preserve">An Ecken (Wendelung, Podest) liegen die Sattelwangen nicht mehr ineinander: das untere Brett läuft bis zur Außenfläche des oberen durch, das obere stößt stumpf an. Das obere Brett beginnt auf Höhe der Unterkante des unteren; die Restbreite bleibt überall eingehalten.</w:t>
       </w:r>
     </w:p>
+    <w:p>
+      <w:pPr>
+        <w:pStyle w:val="Heading2"/>
+        <w:rPr>
+          <w:lang w:val="de-DE"/>
+        </w:rPr>
+      </w:pPr>
+      <w:r>
+        <w:rPr>
+          <w:lang w:val="de-DE"/>
+        </w:rPr>
+        <w:t>Behobene Fehler</w:t>
+      </w:r>
+    </w:p>
+    <w:p>
+      <w:pPr>
+        <w:rPr>
+          <w:lang w:val="de-DE"/>
+        </w:rPr>
+      </w:pPr>
+      <w:r>
+        <w:rPr>
+          <w:lang w:val="de-DE"/>
+        </w:rPr>
+        <w:t>Gemeldete Fehler (Jürgen, fehler.md und Fehlerlisten im Projekt) und wie sie behoben sind. Neue Funktionen stehen oben unter den Versionen.</w:t>
+      </w:r>
+    </w:p>
+    <w:tbl>
+      <w:tblPr>
+        <w:tblStyle w:val="TableGrid"/>
+        <w:tblW w:w="0" w:type="auto"/>
+        <w:tblLayout w:type="fixed"/>
+        <w:tblLook w:val="0420" w:firstRow="1" w:lastRow="0" w:firstColumn="0" w:lastColumn="0" w:noHBand="0" w:noVBand="1"/>
+      </w:tblPr>
+      <w:tblGrid>
+        <w:gridCol w:w="3120"/>
+        <w:gridCol w:w="3120"/>
+        <w:gridCol w:w="3120"/>
+      </w:tblGrid>
+      <w:tr>
+        <w:trPr>
+          <w:tblHeader/>
+        </w:trPr>
+        <w:tc>
+          <w:tcPr>
+            <w:tcW w:w="3120" w:type="dxa"/>
+            <w:shd w:val="clear" w:color="auto" w:fill="F2F2F2"/>
+          </w:tcPr>
+          <w:p>
+            <w:r>
+              <w:t>Version</w:t>
+            </w:r>
+          </w:p>
+        </w:tc>
+        <w:tc>
+          <w:tcPr>
+            <w:tcW w:w="3120" w:type="dxa"/>
+            <w:shd w:val="clear" w:color="auto" w:fill="F2F2F2"/>
+          </w:tcPr>
+          <w:p>
+            <w:r>
+              <w:t>Fehler</w:t>
+            </w:r>
+          </w:p>
+        </w:tc>
+        <w:tc>
+          <w:tcPr>
+            <w:tcW w:w="3120" w:type="dxa"/>
+            <w:shd w:val="clear" w:color="auto" w:fill="F2F2F2"/>
+          </w:tcPr>
+          <w:p>
+            <w:r>
+              <w:t>Behebung</w:t>
+            </w:r>
+          </w:p>
+        </w:tc>
+      </w:tr>
+      <w:tr>
+        <w:tc>
+          <w:tcPr>
+            <w:tcW w:w="3120" w:type="dxa"/>
+          </w:tcPr>
+          <w:p>
+            <w:r>
+              <w:t>2.3.0</w:t>
+            </w:r>
+          </w:p>
+        </w:tc>
+        <w:tc>
+          <w:tcPr>
+            <w:tcW w:w="3120" w:type="dxa"/>
+          </w:tcPr>
+          <w:p>
+            <w:r>
+              <w:t>Geschwungene Wangenform nur für eingestemmte Wangen (fehler.md 1)</w:t>
+            </w:r>
+          </w:p>
+        </w:tc>
+        <w:tc>
+          <w:tcPr>
+            <w:tcW w:w="3120" w:type="dxa"/>
+          </w:tcPr>
+          <w:p>
+            <w:r>
+              <w:t>Wangenform „kurve“ auch für aufgesattelte Wangen: Unterkante als knickfreie Kurve je Lauf.</w:t>
+            </w:r>
+          </w:p>
+        </w:tc>
+      </w:tr>
+      <w:tr>
+        <w:tc>
+          <w:tcPr>
+            <w:tcW w:w="3120" w:type="dxa"/>
+          </w:tcPr>
+          <w:p>
+            <w:r>
+              <w:t>2.3.0</w:t>
+            </w:r>
+          </w:p>
+        </w:tc>
+        <w:tc>
+          <w:tcPr>
+            <w:tcW w:w="3120" w:type="dxa"/>
+          </w:tcPr>
+          <w:p>
+            <w:r>
+              <w:t>Eingestemmte Wange mit konstanter Breite: Stöße nicht bündig (fehler.md 2)</w:t>
+            </w:r>
+          </w:p>
+        </w:tc>
+        <w:tc>
+          <w:tcPr>
+            <w:tcW w:w="3120" w:type="dxa"/>
+          </w:tcPr>
+          <w:p>
+            <w:r>
+              <w:t>Ober- und Unterkante an jedem Stoß bündig, Fugenhöhen gemeinsam.</w:t>
+            </w:r>
+          </w:p>
+        </w:tc>
+      </w:tr>
+      <w:tr>
+        <w:tc>
+          <w:tcPr>
+            <w:tcW w:w="3120" w:type="dxa"/>
+          </w:tcPr>
+          <w:p>
+            <w:r>
+              <w:t>2.3.0</w:t>
+            </w:r>
+          </w:p>
+        </w:tc>
+        <w:tc>
+          <w:tcPr>
+            <w:tcW w:w="3120" w:type="dxa"/>
+          </w:tcPr>
+          <w:p>
+            <w:r>
+              <w:t>Grundmaß der Treppe bei Planung mit Parametern nicht eingebbar (fehler.md 3)</w:t>
+            </w:r>
+          </w:p>
+        </w:tc>
+        <w:tc>
+          <w:tcPr>
+            <w:tcW w:w="3120" w:type="dxa"/>
+          </w:tcPr>
+          <w:p>
+            <w:r>
+              <w:t>Gesamtbreite und -tiefe als Parameter.</w:t>
+            </w:r>
+          </w:p>
+        </w:tc>
+      </w:tr>
+      <w:tr>
+        <w:tc>
+          <w:tcPr>
+            <w:tcW w:w="3120" w:type="dxa"/>
+          </w:tcPr>
+          <w:p>
+            <w:r>
+              <w:t>2.4.0</w:t>
+            </w:r>
+          </w:p>
+        </w:tc>
+        <w:tc>
+          <w:tcPr>
+            <w:tcW w:w="3120" w:type="dxa"/>
+          </w:tcPr>
+          <w:p>
+            <w:r>
+              <w:t>Antritt durfte nicht außerhalb von Raum bzw. Treppenloch liegen (fehler.md 4)</w:t>
+            </w:r>
+          </w:p>
+        </w:tc>
+        <w:tc>
+          <w:tcPr>
+            <w:tcW w:w="3120" w:type="dxa"/>
+          </w:tcPr>
+          <w:p>
+            <w:r>
+              <w:t>Antritt darf außerhalb liegen, der Austritt weiterhin nicht.</w:t>
+            </w:r>
+          </w:p>
+        </w:tc>
+      </w:tr>
+      <w:tr>
+        <w:tc>
+          <w:tcPr>
+            <w:tcW w:w="3120" w:type="dxa"/>
+          </w:tcPr>
+          <w:p>
+            <w:r>
+              <w:t>2.5.0</w:t>
+            </w:r>
+          </w:p>
+        </w:tc>
+        <w:tc>
+          <w:tcPr>
+            <w:tcW w:w="3120" w:type="dxa"/>
+          </w:tcPr>
+          <w:p>
+            <w:r>
+              <w:t>Kein Abstand des Austritts vom Treppenlochrand möglich (fehler.md 5)</w:t>
+            </w:r>
+          </w:p>
+        </w:tc>
+        <w:tc>
+          <w:tcPr>
+            <w:tcW w:w="3120" w:type="dxa"/>
+          </w:tcPr>
+          <w:p>
+            <w:r>
+              <w:t>Neuer Abstand, das entstehende Podest wird mitkonstruiert.</w:t>
+            </w:r>
+          </w:p>
+        </w:tc>
+      </w:tr>
+      <w:tr>
+        <w:tc>
+          <w:tcPr>
+            <w:tcW w:w="3120" w:type="dxa"/>
+          </w:tcPr>
+          <w:p>
+            <w:r>
+              <w:t>2.6.0</w:t>
+            </w:r>
+          </w:p>
+        </w:tc>
+        <w:tc>
+          <w:tcPr>
+            <w:tcW w:w="3120" w:type="dxa"/>
+          </w:tcPr>
+          <w:p>
+            <w:r>
+              <w:t>Umschalten Raum ↔ Parameter veränderte die Treppe (fehler.md 6)</w:t>
+            </w:r>
+          </w:p>
+        </w:tc>
+        <w:tc>
+          <w:tcPr>
+            <w:tcW w:w="3120" w:type="dxa"/>
+          </w:tcPr>
+          <w:p>
+            <w:r>
+              <w:t>Alle Maße werden übernommen, Feinjustierung möglich.</w:t>
+            </w:r>
+          </w:p>
+        </w:tc>
+      </w:tr>
+      <w:tr>
+        <w:tc>
+          <w:tcPr>
+            <w:tcW w:w="3120" w:type="dxa"/>
+          </w:tcPr>
+          <w:p>
+            <w:r>
+              <w:t>2.7.0</w:t>
+            </w:r>
+          </w:p>
+        </w:tc>
+        <w:tc>
+          <w:tcPr>
+            <w:tcW w:w="3120" w:type="dxa"/>
+          </w:tcPr>
+          <w:p>
+            <w:r>
+              <w:t>Aufgesattelte Wange im Wendelbereich: Stufe und Wange lagen ineinander (fehler.md 7)</w:t>
+            </w:r>
+          </w:p>
+        </w:tc>
+        <w:tc>
+          <w:tcPr>
+            <w:tcW w:w="3120" w:type="dxa"/>
+          </w:tcPr>
+          <w:p>
+            <w:r>
+              <w:t>Ausklinkung schräg durch die Brettdicke, CNC je Wange als 3D-Programm mit Seitenaggregat.</w:t>
+            </w:r>
+          </w:p>
+        </w:tc>
+      </w:tr>
+      <w:tr>
+        <w:tc>
+          <w:tcPr>
+            <w:tcW w:w="3120" w:type="dxa"/>
+          </w:tcPr>
+          <w:p>
+            <w:r>
+              <w:t>2.8.0</w:t>
+            </w:r>
+          </w:p>
+        </w:tc>
+        <w:tc>
+          <w:tcPr>
+            <w:tcW w:w="3120" w:type="dxa"/>
+          </w:tcPr>
+          <w:p>
+            <w:r>
+              <w:t>Drachenstufe musste mittig auf der Ecke liegen, Gehlinie wurde dafür verschoben</w:t>
+            </w:r>
+          </w:p>
+        </w:tc>
+        <w:tc>
+          <w:tcPr>
+            <w:tcW w:w="3120" w:type="dxa"/>
+          </w:tcPr>
+          <w:p>
+            <w:r>
+              <w:t>Ecke darf außermittig liegen, Schenkel innen mindestens 2 cm, Gehlinie bleibt.</w:t>
+            </w:r>
+          </w:p>
+        </w:tc>
+      </w:tr>
+      <w:tr>
+        <w:tc>
+          <w:tcPr>
+            <w:tcW w:w="3120" w:type="dxa"/>
+          </w:tcPr>
+          <w:p>
+            <w:r>
+              <w:t>2.11.0</w:t>
+            </w:r>
+          </w:p>
+        </w:tc>
+        <w:tc>
+          <w:tcPr>
+            <w:tcW w:w="3120" w:type="dxa"/>
+          </w:tcPr>
+          <w:p>
+            <w:r>
+              <w:t>Spalt zwischen Stab und geneigtem Handlauf</w:t>
+            </w:r>
+          </w:p>
+        </w:tc>
+        <w:tc>
+          <w:tcPr>
+            <w:tcW w:w="3120" w:type="dxa"/>
+          </w:tcPr>
+          <w:p>
+            <w:r>
+              <w:t>Stäbe lotrecht in den Handlauf gebohrt.</w:t>
+            </w:r>
+          </w:p>
+        </w:tc>
+      </w:tr>
+      <w:tr>
+        <w:tc>
+          <w:tcPr>
+            <w:tcW w:w="3120" w:type="dxa"/>
+          </w:tcPr>
+          <w:p>
+            <w:r>
+              <w:t>2.11.0</w:t>
+            </w:r>
+          </w:p>
+        </w:tc>
+        <w:tc>
+          <w:tcPr>
+            <w:tcW w:w="3120" w:type="dxa"/>
+          </w:tcPr>
+          <w:p>
+            <w:r>
+              <w:t>Handlauf an Eckpfosten zu kurz bzw. im Pfosten</w:t>
+            </w:r>
+          </w:p>
+        </w:tc>
+        <w:tc>
+          <w:tcPr>
+            <w:tcW w:w="3120" w:type="dxa"/>
+          </w:tcPr>
+          <w:p>
+            <w:r>
+              <w:t>Handlauf endet genau an der Pfostenfläche.</w:t>
+            </w:r>
+          </w:p>
+        </w:tc>
+      </w:tr>
+      <w:tr>
+        <w:tc>
+          <w:tcPr>
+            <w:tcW w:w="3120" w:type="dxa"/>
+          </w:tcPr>
+          <w:p>
+            <w:r>
+              <w:t>2.11.0</w:t>
+            </w:r>
+          </w:p>
+        </w:tc>
+        <w:tc>
+          <w:tcPr>
+            <w:tcW w:w="3120" w:type="dxa"/>
+          </w:tcPr>
+          <w:p>
+            <w:r>
+              <w:t>Aufgesattelte Wange: Antritts- und Austrittspfosten falsch</w:t>
+            </w:r>
+          </w:p>
+        </w:tc>
+        <w:tc>
+          <w:tcPr>
+            <w:tcW w:w="3120" w:type="dxa"/>
+          </w:tcPr>
+          <w:p>
+            <w:r>
+              <w:t>Pfosten stehen in der Treppe, die Wange endet an der Pfostenfläche.</w:t>
+            </w:r>
+          </w:p>
+        </w:tc>
+      </w:tr>
+      <w:tr>
+        <w:tc>
+          <w:tcPr>
+            <w:tcW w:w="3120" w:type="dxa"/>
+          </w:tcPr>
+          <w:p>
+            <w:r>
+              <w:t>2.15.0</w:t>
+            </w:r>
+          </w:p>
+        </w:tc>
+        <w:tc>
+          <w:tcPr>
+            <w:tcW w:w="3120" w:type="dxa"/>
+          </w:tcPr>
+          <w:p>
+            <w:r>
+              <w:t>Horizontaler Stababstand nicht überall gleich</w:t>
+            </w:r>
+          </w:p>
+        </w:tc>
+        <w:tc>
+          <w:tcPr>
+            <w:tcW w:w="3120" w:type="dxa"/>
+          </w:tcPr>
+          <w:p>
+            <w:r>
+              <w:t>Ein Abstand je Geländerseite, bei eingestemmten und aufgesattelten Wangen.</w:t>
+            </w:r>
+          </w:p>
+        </w:tc>
+      </w:tr>
+      <w:tr>
+        <w:tc>
+          <w:tcPr>
+            <w:tcW w:w="3120" w:type="dxa"/>
+          </w:tcPr>
+          <w:p>
+            <w:r>
+              <w:t>2.16.0</w:t>
+            </w:r>
+          </w:p>
+        </w:tc>
+        <w:tc>
+          <w:tcPr>
+            <w:tcW w:w="3120" w:type="dxa"/>
+          </w:tcPr>
+          <w:p>
+            <w:r>
+              <w:t>TCN breiter als die Maschine (Y &gt; 1300 mm)</w:t>
+            </w:r>
+          </w:p>
+        </w:tc>
+        <w:tc>
+          <w:tcPr>
+            <w:tcW w:w="3120" w:type="dxa"/>
+          </w:tcPr>
+          <w:p>
+            <w:r>
+              <w:t>Maschinenbreite mach_w 1300 mm; breitere Rohlinge werden nicht exportiert.</w:t>
+            </w:r>
+          </w:p>
+        </w:tc>
+      </w:tr>
+      <w:tr>
+        <w:tc>
+          <w:tcPr>
+            <w:tcW w:w="3120" w:type="dxa"/>
+          </w:tcPr>
+          <w:p>
+            <w:r>
+              <w:t>2.16.0</w:t>
+            </w:r>
+          </w:p>
+        </w:tc>
+        <w:tc>
+          <w:tcPr>
+            <w:tcW w:w="3120" w:type="dxa"/>
+          </w:tcPr>
+          <w:p>
+            <w:r>
+              <w:t>Geländerpfosten nicht als einzelne TCN</w:t>
+            </w:r>
+          </w:p>
+        </w:tc>
+        <w:tc>
+          <w:tcPr>
+            <w:tcW w:w="3120" w:type="dxa"/>
+          </w:tcPr>
+          <w:p>
+            <w:r>
+              <w:t>Je Pfosten ein eigener Rohling und eine TCN.</w:t>
+            </w:r>
+          </w:p>
+        </w:tc>
+      </w:tr>
+      <w:tr>
+        <w:tc>
+          <w:tcPr>
+            <w:tcW w:w="3120" w:type="dxa"/>
+          </w:tcPr>
+          <w:p>
+            <w:r>
+              <w:t>2.16.0</w:t>
+            </w:r>
+          </w:p>
+        </w:tc>
+        <w:tc>
+          <w:tcPr>
+            <w:tcW w:w="3120" w:type="dxa"/>
+          </w:tcPr>
+          <w:p>
+            <w:r>
+              <w:t>Geländerstäbe als TCN, obwohl anders gefertigt</w:t>
+            </w:r>
+          </w:p>
+        </w:tc>
+        <w:tc>
+          <w:tcPr>
+            <w:tcW w:w="3120" w:type="dxa"/>
+          </w:tcPr>
+          <w:p>
+            <w:r>
+              <w:t>Keine TCN; Teileliste und Nacharbeit mit Querschnitt und Längen.</w:t>
+            </w:r>
+          </w:p>
+        </w:tc>
+      </w:tr>
+      <w:tr>
+        <w:tc>
+          <w:tcPr>
+            <w:tcW w:w="3120" w:type="dxa"/>
+          </w:tcPr>
+          <w:p>
+            <w:r>
+              <w:t>2.16.0</w:t>
+            </w:r>
+          </w:p>
+        </w:tc>
+        <w:tc>
+          <w:tcPr>
+            <w:tcW w:w="3120" w:type="dxa"/>
+          </w:tcPr>
+          <w:p>
+            <w:r>
+              <w:t>Gerade Handläufe als TCN, obwohl klassisch gefertigt</w:t>
+            </w:r>
+          </w:p>
+        </w:tc>
+        <w:tc>
+          <w:tcPr>
+            <w:tcW w:w="3120" w:type="dxa"/>
+          </w:tcPr>
+          <w:p>
+            <w:r>
+              <w:t>Keine TCN; Nacharbeit mit Länge, Querschnitt, Neigung und Bohrungen.</w:t>
+            </w:r>
+          </w:p>
+        </w:tc>
+      </w:tr>
+      <w:tr>
+        <w:tc>
+          <w:tcPr>
+            <w:tcW w:w="3120" w:type="dxa"/>
+          </w:tcPr>
+          <w:p>
+            <w:r>
+              <w:t>2.12.0 / 2.17.0</w:t>
+            </w:r>
+          </w:p>
+        </w:tc>
+        <w:tc>
+          <w:tcPr>
+            <w:tcW w:w="3120" w:type="dxa"/>
+          </w:tcPr>
+          <w:p>
+            <w:r>
+              <w:t>Überlange Wangen: Lauf A/B ohne Feldzuweisung N1/N</w:t>
+            </w:r>
+          </w:p>
+        </w:tc>
+        <w:tc>
+          <w:tcPr>
+            <w:tcW w:w="3120" w:type="dxa"/>
+          </w:tcPr>
+          <w:p>
+            <w:r>
+              <w:t>Kopfzeile s3 (Lauf A, Feld N1) und s6 (Lauf B, Feld N) seit 2.12.0; Vorschau beschriftet die Läufe (2.17.0). In TpaCAD noch zu prüfen.</w:t>
+            </w:r>
+          </w:p>
+        </w:tc>
+      </w:tr>
+      <w:tr>
+        <w:tc>
+          <w:tcPr>
+            <w:tcW w:w="3120" w:type="dxa"/>
+          </w:tcPr>
+          <w:p>
+            <w:r>
+              <w:t>2.17.0</w:t>
+            </w:r>
+          </w:p>
+        </w:tc>
+        <w:tc>
+          <w:tcPr>
+            <w:tcW w:w="3120" w:type="dxa"/>
+          </w:tcPr>
+          <w:p>
+            <w:r>
+              <w:t>Überlange Wangen: Bohrungen für die Geländerstäbe fehlten</w:t>
+            </w:r>
+          </w:p>
+        </w:tc>
+        <w:tc>
+          <w:tcPr>
+            <w:tcW w:w="3120" w:type="dxa"/>
+          </w:tcPr>
+          <w:p>
+            <w:r>
+              <w:t>Bohrungen waren in den TCN enthalten; die Vorschau zeigt sie jetzt auch bei Teilen mit eigenem Rohling.</w:t>
+            </w:r>
+          </w:p>
+        </w:tc>
+      </w:tr>
+      <w:tr>
+        <w:tc>
+          <w:tcPr>
+            <w:tcW w:w="3120" w:type="dxa"/>
+          </w:tcPr>
+          <w:p>
+            <w:r>
+              <w:t>2.18.0</w:t>
+            </w:r>
+          </w:p>
+        </w:tc>
+        <w:tc>
+          <w:tcPr>
+            <w:tcW w:w="3120" w:type="dxa"/>
+          </w:tcPr>
+          <w:p>
+            <w:r>
+              <w:t>Halbgewendelt, geschwungene Wangen: Spitze der Innenwange des 2. Laufs am Zwischenstück</w:t>
+            </w:r>
+          </w:p>
+        </w:tc>
+        <w:tc>
+          <w:tcPr>
+            <w:tcW w:w="3120" w:type="dxa"/>
+          </w:tcPr>
+          <w:p>
+            <w:r>
+              <w:t>Stumpf: Unterkante bis zur Unterkante des Zwischenstücks, vollflächige Verbindung.</w:t>
+            </w:r>
+          </w:p>
+        </w:tc>
+      </w:tr>
+      <w:tr>
+        <w:tc>
+          <w:tcPr>
+            <w:tcW w:w="3120" w:type="dxa"/>
+          </w:tcPr>
+          <w:p>
+            <w:r>
+              <w:t>2.18.0</w:t>
+            </w:r>
+          </w:p>
+        </w:tc>
+        <w:tc>
+          <w:tcPr>
+            <w:tcW w:w="3120" w:type="dxa"/>
+          </w:tcPr>
+          <w:p>
+            <w:r>
+              <w:t>Halbgewendelt am Zwischenstück: Handlauf zu dünn für die Stäbe</w:t>
+            </w:r>
+          </w:p>
+        </w:tc>
+        <w:tc>
+          <w:tcPr>
+            <w:tcW w:w="3120" w:type="dxa"/>
+          </w:tcPr>
+          <w:p>
+            <w:r>
+              <w:t>Handlauf überall mindestens rail_hh dick, rechtwinklig zur Achse.</w:t>
+            </w:r>
+          </w:p>
+        </w:tc>
+      </w:tr>
+    </w:tbl>
     <w:p>
       <w:pPr>
         <w:pStyle w:val="Heading2"/>
@@ -2356,7 +3267,7 @@
           <w:rStyle w:val="CodeChar"/>
           <w:lang w:val="de-DE"/>
         </w:rPr>
-        <w:t>treppenbau_2.17.0.rbz (GitHub-Repository jimmycd/sketchup-treppenbauer, Hauptordner auf main) auswählen und bestätigen.</w:t>
+        <w:t>treppenbau_2.19.0.rbz (GitHub-Repository jimmycd/sketchup-treppenbauer, Hauptordner auf main) auswählen und bestätigen.</w:t>
       </w:r>
     </w:p>
     <w:p>
@@ -8721,6 +9632,126 @@
           </w:tcPr>
           <w:p>
             <w:r>
+              <w:t>Dübel je Stufe (sat_dowels)</w:t>
+            </w:r>
+          </w:p>
+        </w:tc>
+        <w:tc>
+          <w:tcPr>
+            <w:tcW w:w="1872" w:type="dxa"/>
+          </w:tcPr>
+          <w:p>
+            <w:r>
+              <w:t>Stk, 2</w:t>
+            </w:r>
+          </w:p>
+        </w:tc>
+        <w:tc>
+          <w:tcPr>
+            <w:tcW w:w="1872" w:type="dxa"/>
+          </w:tcPr>
+          <w:p>
+            <w:r>
+              <w:t>aufgesattelt</w:t>
+            </w:r>
+          </w:p>
+        </w:tc>
+        <w:tc>
+          <w:tcPr>
+            <w:tcW w:w="1872" w:type="dxa"/>
+          </w:tcPr>
+          <w:p>
+            <w:pPr>
+              <w:rPr>
+                <w:lang w:val="de-DE"/>
+              </w:rPr>
+            </w:pPr>
+            <w:r>
+              <w:rPr>
+                <w:lang w:val="de-DE"/>
+              </w:rPr>
+              <w:t>Dübel je Auflager, gleichmäßig verteilt (bei 2 auf ¼ und ¾), mittig in der Wangendicke; Tiefe wie dowel_depth, in der Stufe höchstens Stufendicke − 1 cm. Wange: CNC (Bohraggregat), Stufe: Bohrliste in der Nacharbeit. 0 = keine.</w:t>
+            </w:r>
+          </w:p>
+        </w:tc>
+        <w:tc>
+          <w:tcPr>
+            <w:tcW w:w="1872" w:type="dxa"/>
+          </w:tcPr>
+          <w:p>
+            <w:r>
+              <w:t>2</w:t>
+            </w:r>
+          </w:p>
+        </w:tc>
+      </w:tr>
+      <w:tr>
+        <w:tc>
+          <w:tcPr>
+            <w:tcW w:w="1872" w:type="dxa"/>
+          </w:tcPr>
+          <w:p>
+            <w:r>
+              <w:t>Dübel Ø (sat_dowel_d)</w:t>
+            </w:r>
+          </w:p>
+        </w:tc>
+        <w:tc>
+          <w:tcPr>
+            <w:tcW w:w="1872" w:type="dxa"/>
+          </w:tcPr>
+          <w:p>
+            <w:r>
+              <w:t>cm, 1,0</w:t>
+            </w:r>
+          </w:p>
+        </w:tc>
+        <w:tc>
+          <w:tcPr>
+            <w:tcW w:w="1872" w:type="dxa"/>
+          </w:tcPr>
+          <w:p>
+            <w:r>
+              <w:t>aufgesattelt</w:t>
+            </w:r>
+          </w:p>
+        </w:tc>
+        <w:tc>
+          <w:tcPr>
+            <w:tcW w:w="1872" w:type="dxa"/>
+          </w:tcPr>
+          <w:p>
+            <w:pPr>
+              <w:rPr>
+                <w:lang w:val="de-DE"/>
+              </w:rPr>
+            </w:pPr>
+            <w:r>
+              <w:rPr>
+                <w:lang w:val="de-DE"/>
+              </w:rPr>
+              <w:t>Durchmesser der Dübel zwischen Stufe und Wange.</w:t>
+            </w:r>
+          </w:p>
+        </w:tc>
+        <w:tc>
+          <w:tcPr>
+            <w:tcW w:w="1872" w:type="dxa"/>
+          </w:tcPr>
+          <w:p>
+            <w:r>
+              <w:t>1,0</w:t>
+            </w:r>
+          </w:p>
+        </w:tc>
+      </w:tr>
+      <w:tr>
+        <w:tc>
+          <w:tcPr>
+            <w:tcW w:w="1872" w:type="dxa"/>
+          </w:tcPr>
+          <w:p>
+            <w:r>
               <w:t xml:space="preserve">Holmbreite (</w:t>
             </w:r>
             <w:r>
@@ -13109,6 +14140,454 @@
         <w:rPr>
           <w:lang w:val="de-DE"/>
         </w:rPr>
+        <w:t>Konstruktion – warum was wie aufgebaut ist</w:t>
+      </w:r>
+    </w:p>
+    <w:p>
+      <w:pPr>
+        <w:rPr>
+          <w:lang w:val="de-DE"/>
+        </w:rPr>
+      </w:pPr>
+      <w:r>
+        <w:rPr>
+          <w:lang w:val="de-DE"/>
+        </w:rPr>
+        <w:t>Alle Holzteile sind so aufgebaut, dass sie aus Platten und Bohlen auf einer 3-Achs-CNC mit Bohr- und Seitenaggregat gefertigt werden können: Bretter bleiben im Grundriss gerade, alle Kanten stehen rechtwinklig zur Brettfläche oder sind als ebene Schräge mit dem Seitenaggregat fräsbar.</w:t>
+      </w:r>
+    </w:p>
+    <w:p>
+      <w:pPr>
+        <w:pStyle w:val="Heading3"/>
+        <w:rPr>
+          <w:lang w:val="de-DE"/>
+        </w:rPr>
+      </w:pPr>
+      <w:r>
+        <w:rPr>
+          <w:lang w:val="de-DE"/>
+        </w:rPr>
+        <w:t>Grundriss und Stufen</w:t>
+      </w:r>
+    </w:p>
+    <w:p>
+      <w:pPr>
+        <w:rPr>
+          <w:lang w:val="de-DE"/>
+        </w:rPr>
+      </w:pPr>
+      <w:r>
+        <w:rPr>
+          <w:lang w:val="de-DE"/>
+        </w:rPr>
+        <w:t>Der Grundriss besteht aus drei Linien in Laufrichtung: Innenkante, Gehlinie und Außenkante. Jede Stufenkante läuft von der Innenkante durch die Gehlinie bis zur Außenkante; die Lage an der Innenkante steuert das Verziehen der Wendelstufen. An jeder Ecke liegt eine Drachenstufe, deren innere Schenkel mindestens 2 cm lang sind, damit die Stufe innen noch auf der Wange aufliegt. Podeste sind parallel verschobene Stufenkanten.</w:t>
+      </w:r>
+    </w:p>
+    <w:p>
+      <w:pPr>
+        <w:pStyle w:val="Heading3"/>
+        <w:rPr>
+          <w:lang w:val="de-DE"/>
+        </w:rPr>
+      </w:pPr>
+      <w:r>
+        <w:rPr>
+          <w:lang w:val="de-DE"/>
+        </w:rPr>
+        <w:t>Eingestemmte Wange</w:t>
+      </w:r>
+    </w:p>
+    <w:p>
+      <w:pPr>
+        <w:pStyle w:val="ListParagraph"/>
+        <w:numPr>
+          <w:ilvl w:val="0"/>
+          <w:numId w:val="2"/>
+        </w:numPr>
+        <w:rPr>
+          <w:lang w:val="de-DE"/>
+        </w:rPr>
+      </w:pPr>
+      <w:r>
+        <w:rPr>
+          <w:lang w:val="de-DE"/>
+        </w:rPr>
+        <w:t>Die Stufen laufen in Nuten (Einstand) der Wange. Die Nuten werden exakt aus dem Stufenumriss abgeleitet, damit Tritt- und Setzstufe ohne Luft sitzen.</w:t>
+      </w:r>
+    </w:p>
+    <w:p>
+      <w:pPr>
+        <w:pStyle w:val="ListParagraph"/>
+        <w:numPr>
+          <w:ilvl w:val="0"/>
+          <w:numId w:val="2"/>
+        </w:numPr>
+        <w:rPr>
+          <w:lang w:val="de-DE"/>
+        </w:rPr>
+      </w:pPr>
+      <w:r>
+        <w:rPr>
+          <w:lang w:val="de-DE"/>
+        </w:rPr>
+        <w:t>Jedes Brett ist im Grundriss gerade. Oberkante str_over über den Stufenvorderkanten, Unterkante mindestens str_under unter den Stufen. Gerade Form: konstante Brettbreite (alle Bretter gleich, aus einer Bohle). Geschwungene Form: knickfreie Kurven, die Breite variiert, im Wendelbereich bleibt die Wange schlank.</w:t>
+      </w:r>
+    </w:p>
+    <w:p>
+      <w:pPr>
+        <w:pStyle w:val="ListParagraph"/>
+        <w:numPr>
+          <w:ilvl w:val="0"/>
+          <w:numId w:val="2"/>
+        </w:numPr>
+        <w:rPr>
+          <w:lang w:val="de-DE"/>
+        </w:rPr>
+      </w:pPr>
+      <w:r>
+        <w:rPr>
+          <w:lang w:val="de-DE"/>
+        </w:rPr>
+        <w:t>Das Brett ist ein Körper aus zwei Flächenumrissen; Ober- und Unterkante stehen rechtwinklig zur Brettfläche. So entstehen keine verwundenen Flächen und das Brett ist ohne 5-Achs-Bearbeitung fräsbar.</w:t>
+      </w:r>
+    </w:p>
+    <w:p>
+      <w:pPr>
+        <w:pStyle w:val="Heading3"/>
+        <w:rPr>
+          <w:lang w:val="de-DE"/>
+        </w:rPr>
+      </w:pPr>
+      <w:r>
+        <w:rPr>
+          <w:lang w:val="de-DE"/>
+        </w:rPr>
+        <w:t>Aufgesattelte Wange</w:t>
+      </w:r>
+    </w:p>
+    <w:p>
+      <w:pPr>
+        <w:pStyle w:val="ListParagraph"/>
+        <w:numPr>
+          <w:ilvl w:val="0"/>
+          <w:numId w:val="2"/>
+        </w:numPr>
+        <w:rPr>
+          <w:lang w:val="de-DE"/>
+        </w:rPr>
+      </w:pPr>
+      <w:r>
+        <w:rPr>
+          <w:lang w:val="de-DE"/>
+        </w:rPr>
+        <w:t>Die Wange liegt unter den Stufen, um sat_inset von der Laufkante eingerückt; die Oberkante ist sägezahnförmig mit einem waagerechten Auflager je Stufe.</w:t>
+      </w:r>
+    </w:p>
+    <w:p>
+      <w:pPr>
+        <w:pStyle w:val="ListParagraph"/>
+        <w:numPr>
+          <w:ilvl w:val="0"/>
+          <w:numId w:val="2"/>
+        </w:numPr>
+        <w:rPr>
+          <w:lang w:val="de-DE"/>
+        </w:rPr>
+      </w:pPr>
+      <w:r>
+        <w:rPr>
+          <w:lang w:val="de-DE"/>
+        </w:rPr>
+        <w:t>Die senkrechte Ausklinkung folgt der Stufenkante schräg durch die Brettdicke. Im Wendelbereich läuft die Stufenkante schräg über das Brett; eine rechtwinklige Ausklinkung würde Stufe und Wange ineinander schieben.</w:t>
+      </w:r>
+    </w:p>
+    <w:p>
+      <w:pPr>
+        <w:pStyle w:val="ListParagraph"/>
+        <w:numPr>
+          <w:ilvl w:val="0"/>
+          <w:numId w:val="2"/>
+        </w:numPr>
+        <w:rPr>
+          <w:lang w:val="de-DE"/>
+        </w:rPr>
+      </w:pPr>
+      <w:r>
+        <w:rPr>
+          <w:lang w:val="de-DE"/>
+        </w:rPr>
+        <w:t>Unter jeder inneren Ecke bleibt mindestens sat_rest Holz stehen (rechtwinklig gemessen), damit die Wange dort nicht bricht. Podeste sind eigene waagerechte Bretter.</w:t>
+      </w:r>
+    </w:p>
+    <w:p>
+      <w:pPr>
+        <w:pStyle w:val="ListParagraph"/>
+        <w:numPr>
+          <w:ilvl w:val="0"/>
+          <w:numId w:val="2"/>
+        </w:numPr>
+        <w:rPr>
+          <w:lang w:val="de-DE"/>
+        </w:rPr>
+      </w:pPr>
+      <w:r>
+        <w:rPr>
+          <w:lang w:val="de-DE"/>
+        </w:rPr>
+        <w:t>Jede Stufe ist mit 2 Dübeln Ø 10 mm auf der Wange gesichert. Die Dübel halten die Stufe in Lage und nehmen Schub auf, ohne sichtbare Verbindungsmittel. Die Wange bohrt die CNC, die Stufe wird nach der Bohrliste gebohrt (die Stufenoberseite bleibt auf der CNC oben, mit den Stabbohrungen).</w:t>
+      </w:r>
+    </w:p>
+    <w:p>
+      <w:pPr>
+        <w:pStyle w:val="Heading3"/>
+        <w:rPr>
+          <w:lang w:val="de-DE"/>
+        </w:rPr>
+      </w:pPr>
+      <w:r>
+        <w:rPr>
+          <w:lang w:val="de-DE"/>
+        </w:rPr>
+        <w:t>Wangenstöße</w:t>
+      </w:r>
+    </w:p>
+    <w:p>
+      <w:pPr>
+        <w:pStyle w:val="ListParagraph"/>
+        <w:numPr>
+          <w:ilvl w:val="0"/>
+          <w:numId w:val="2"/>
+        </w:numPr>
+        <w:rPr>
+          <w:lang w:val="de-DE"/>
+        </w:rPr>
+      </w:pPr>
+      <w:r>
+        <w:rPr>
+          <w:lang w:val="de-DE"/>
+        </w:rPr>
+        <w:t>Alle Stöße sind stumpf, ohne Gehrung: ein Brett läuft durch, das andere stößt rechtwinklig oder mit passender Schräge an. Stumpfe Stöße lassen sich ohne spitze Winkel fräsen und verleimen.</w:t>
+      </w:r>
+    </w:p>
+    <w:p>
+      <w:pPr>
+        <w:pStyle w:val="ListParagraph"/>
+        <w:numPr>
+          <w:ilvl w:val="0"/>
+          <w:numId w:val="2"/>
+        </w:numPr>
+        <w:rPr>
+          <w:lang w:val="de-DE"/>
+        </w:rPr>
+      </w:pPr>
+      <w:r>
+        <w:rPr>
+          <w:lang w:val="de-DE"/>
+        </w:rPr>
+        <w:t>L-Treppe: die von unten kommende Wange läuft durch, die folgende ist um die Wangendicke gekürzt.</w:t>
+      </w:r>
+    </w:p>
+    <w:p>
+      <w:pPr>
+        <w:pStyle w:val="ListParagraph"/>
+        <w:numPr>
+          <w:ilvl w:val="0"/>
+          <w:numId w:val="2"/>
+        </w:numPr>
+        <w:rPr>
+          <w:lang w:val="de-DE"/>
+        </w:rPr>
+      </w:pPr>
+      <w:r>
+        <w:rPr>
+          <w:lang w:val="de-DE"/>
+        </w:rPr>
+        <w:t>U-Treppe (halbgewendelt): die Wangen der beiden Läufe laufen durch, das Zwischenstück dazwischen ist um beide Dicken gekürzt. Die Innenwange des 2. Laufs reicht am Anfang mit ihrer Unterkante bis zur Unterkante des Zwischenstücks, damit dessen Stirn vollflächig anliegt.</w:t>
+      </w:r>
+    </w:p>
+    <w:p>
+      <w:pPr>
+        <w:pStyle w:val="Heading3"/>
+        <w:rPr>
+          <w:lang w:val="de-DE"/>
+        </w:rPr>
+      </w:pPr>
+      <w:r>
+        <w:rPr>
+          <w:lang w:val="de-DE"/>
+        </w:rPr>
+        <w:t>Pfosten als Zwischenstücke</w:t>
+      </w:r>
+    </w:p>
+    <w:p>
+      <w:pPr>
+        <w:pStyle w:val="ListParagraph"/>
+        <w:numPr>
+          <w:ilvl w:val="0"/>
+          <w:numId w:val="2"/>
+        </w:numPr>
+        <w:rPr>
+          <w:lang w:val="de-DE"/>
+        </w:rPr>
+      </w:pPr>
+      <w:r>
+        <w:rPr>
+          <w:lang w:val="de-DE"/>
+        </w:rPr>
+        <w:t>Auf Geländerseiten stehen Pfosten am Antritt, am Austritt und an jedem Laufwechsel. Die Wangen enden dort rechtwinklig an der Pfostenfläche; der Pfosten ist das Zwischenstück der Ecke.</w:t>
+      </w:r>
+    </w:p>
+    <w:p>
+      <w:pPr>
+        <w:pStyle w:val="ListParagraph"/>
+        <w:numPr>
+          <w:ilvl w:val="0"/>
+          <w:numId w:val="2"/>
+        </w:numPr>
+        <w:rPr>
+          <w:lang w:val="de-DE"/>
+        </w:rPr>
+      </w:pPr>
+      <w:r>
+        <w:rPr>
+          <w:lang w:val="de-DE"/>
+        </w:rPr>
+        <w:t>Wange und Pfosten sind verdübelt (dowel_d 10 mm, 2–4 Dübel je Wangenende, nicht in den Stufennuten). Die Stirnbohrung in der eingestemmten Wange macht die CNC.</w:t>
+      </w:r>
+    </w:p>
+    <w:p>
+      <w:pPr>
+        <w:pStyle w:val="ListParagraph"/>
+        <w:numPr>
+          <w:ilvl w:val="0"/>
+          <w:numId w:val="2"/>
+        </w:numPr>
+        <w:rPr>
+          <w:lang w:val="de-DE"/>
+        </w:rPr>
+      </w:pPr>
+      <w:r>
+        <w:rPr>
+          <w:lang w:val="de-DE"/>
+        </w:rPr>
+        <w:t>Tritt- und Setzstufen laufen um post_pocket (1,5 cm) in eine Tasche im Pfosten. Die Fuge ist so verdeckt und die Stufe liegt im Pfosten auf; befestigt wird mit einer Schraube oder einem Dübel durch den Pfosten.</w:t>
+      </w:r>
+    </w:p>
+    <w:p>
+      <w:pPr>
+        <w:pStyle w:val="ListParagraph"/>
+        <w:numPr>
+          <w:ilvl w:val="0"/>
+          <w:numId w:val="2"/>
+        </w:numPr>
+        <w:rPr>
+          <w:lang w:val="de-DE"/>
+        </w:rPr>
+      </w:pPr>
+      <w:r>
+        <w:rPr>
+          <w:lang w:val="de-DE"/>
+        </w:rPr>
+        <w:t>Ist ein Feld länger als rail_mid (200 cm), steht in der Mitte ein Zwischenpfosten unter dem durchlaufenden Handlauf.</w:t>
+      </w:r>
+    </w:p>
+    <w:p>
+      <w:pPr>
+        <w:pStyle w:val="Heading3"/>
+        <w:rPr>
+          <w:lang w:val="de-DE"/>
+        </w:rPr>
+      </w:pPr>
+      <w:r>
+        <w:rPr>
+          <w:lang w:val="de-DE"/>
+        </w:rPr>
+        <w:t>Geländer</w:t>
+      </w:r>
+    </w:p>
+    <w:p>
+      <w:pPr>
+        <w:pStyle w:val="ListParagraph"/>
+        <w:numPr>
+          <w:ilvl w:val="0"/>
+          <w:numId w:val="2"/>
+        </w:numPr>
+        <w:rPr>
+          <w:lang w:val="de-DE"/>
+        </w:rPr>
+      </w:pPr>
+      <w:r>
+        <w:rPr>
+          <w:lang w:val="de-DE"/>
+        </w:rPr>
+        <w:t>Der Handlauf ist rechteckig, läuft von Pfosten zu Pfosten und ist so breit wie die Wange. Seine Oberkante liegt rail_h über den Stufenvorderkanten; die Dicke rail_hh gilt rechtwinklig zur Handlaufachse, damit er auch an steilen Stellen dick genug für die Stabbohrungen bleibt.</w:t>
+      </w:r>
+    </w:p>
+    <w:p>
+      <w:pPr>
+        <w:pStyle w:val="ListParagraph"/>
+        <w:numPr>
+          <w:ilvl w:val="0"/>
+          <w:numId w:val="2"/>
+        </w:numPr>
+        <w:rPr>
+          <w:lang w:val="de-DE"/>
+        </w:rPr>
+      </w:pPr>
+      <w:r>
+        <w:rPr>
+          <w:lang w:val="de-DE"/>
+        </w:rPr>
+        <w:t>Wangenform gerade: Handlauf je Feld gerade, klassisch gefertigt. Wangenform geschwungen: Handlauf als knickfreie Kurve, aus dem Vollen gefräst.</w:t>
+      </w:r>
+    </w:p>
+    <w:p>
+      <w:pPr>
+        <w:pStyle w:val="ListParagraph"/>
+        <w:numPr>
+          <w:ilvl w:val="0"/>
+          <w:numId w:val="2"/>
+        </w:numPr>
+        <w:rPr>
+          <w:lang w:val="de-DE"/>
+        </w:rPr>
+      </w:pPr>
+      <w:r>
+        <w:rPr>
+          <w:lang w:val="de-DE"/>
+        </w:rPr>
+        <w:t>Alle Stäbe einer Geländerseite haben denselben waagerechten Abstand (lichter Abstand höchstens bal_gap, DIN 18065: 12 cm); das ergibt ein ruhiges Bild über Läufe und Wendelung hinweg.</w:t>
+      </w:r>
+    </w:p>
+    <w:p>
+      <w:pPr>
+        <w:pStyle w:val="ListParagraph"/>
+        <w:numPr>
+          <w:ilvl w:val="0"/>
+          <w:numId w:val="2"/>
+        </w:numPr>
+        <w:rPr>
+          <w:lang w:val="de-DE"/>
+        </w:rPr>
+      </w:pPr>
+      <w:r>
+        <w:rPr>
+          <w:lang w:val="de-DE"/>
+        </w:rPr>
+        <w:t>Unten stecken die Stäbe in der Wangenoberkante (eingestemmt) bzw. in der Stufe (aufgesattelt, frei), oben lotrecht im Handlauf. Bei Stäben auf Stufen wird die Reihe so verschoben, dass möglichst kein Stab näher als bal_edge an einer Stufenkante steht.</w:t>
+      </w:r>
+    </w:p>
+    <w:p>
+      <w:pPr>
+        <w:pStyle w:val="Heading2"/>
+        <w:rPr>
+          <w:lang w:val="de-DE"/>
+        </w:rPr>
+      </w:pPr>
+      <w:r>
+        <w:rPr>
+          <w:lang w:val="de-DE"/>
+        </w:rPr>
         <w:t>Export und CNC</w:t>
       </w:r>
     </w:p>
@@ -13120,7 +14599,6 @@
       </w:pPr>
       <w:r>
         <w:rPr>
-          <w:b/>
           <w:lang w:val="de-DE"/>
         </w:rPr>
         <w:t>CNC-Export (TCN für TpaCAD)… zerlegt die gewählte Treppe in Frästeile. Tritt- und Setzstufen werden je Materialstärke auf Rohplatten verschachtelt (höchstens Maschinenbreite, Standard 1300 mm), eingestemmte und aufgesattelte Wangen, geschwungene Handläufe und Geländerpfosten bekommen je Teil einen eigenen Rohling und eine eigene TCN; Teile länger als der Verfahrweg in zwei Läufen (A/B). Geländerstäbe und gerade Handläufe werden nicht gefräst, sondern nur in Teileliste und Nacharbeit aufgeführt. Alle Maße hier in mm. Die Vorschau zeigt Platten und Rohlinge mit Nuten, Bohrungen, Teilung und Warnungen; erst Exportieren fragt nach dem Zielordner.</w:t>
@@ -15119,7 +16597,7 @@
           <w:rStyle w:val="CodeChar"/>
           <w:lang w:val="de-DE"/>
         </w:rPr>
-        <w:t>Haus_Treppe_EG_Nacharbeit.txt – Einrichtung der Läufe A/B, Nacharbeit aufgesattelter Wangen, Geländerstäbe (Zuschnitt) und gerade Handläufe (Maße, Bohrungen)</w:t>
+        <w:t>Haus_Treppe_EG_Nacharbeit.txt – Einrichtung der Läufe A/B, Nacharbeit aufgesattelter Wangen, Bohrliste der Stufendübel (aufgesattelte Wange), Geländerstäbe (Zuschnitt) und gerade Handläufe (Maße, Bohrungen)</w:t>
       </w:r>
     </w:p>
     <w:p>
@@ -15171,6 +16649,400 @@
           <w:lang w:val="de-DE"/>
         </w:rPr>
         <w:t>In jeder TCN-Datei kommen Gravur, Nuten und Bohrungen von oben zuerst, dann die Außenkontur, zuletzt Bohrungen und Schrägen mit dem Aggregat. Kopfzeile: Feld s1, bei Lauf A s3 (Feld N1), bei Lauf B s6 (Feld N). Der Zielordner wird mit dxf4tcn geteilt.</w:t>
+      </w:r>
+    </w:p>
+    <w:p>
+      <w:pPr>
+        <w:pStyle w:val="Heading2"/>
+        <w:rPr>
+          <w:lang w:val="de-DE"/>
+        </w:rPr>
+      </w:pPr>
+      <w:r>
+        <w:rPr>
+          <w:lang w:val="de-DE"/>
+        </w:rPr>
+        <w:t>CNC-Logik</w:t>
+      </w:r>
+    </w:p>
+    <w:p>
+      <w:pPr>
+        <w:pStyle w:val="Heading3"/>
+        <w:rPr>
+          <w:lang w:val="de-DE"/>
+        </w:rPr>
+      </w:pPr>
+      <w:r>
+        <w:rPr>
+          <w:lang w:val="de-DE"/>
+        </w:rPr>
+        <w:t>Was wie gefertigt wird</w:t>
+      </w:r>
+    </w:p>
+    <w:p>
+      <w:pPr>
+        <w:pStyle w:val="ListParagraph"/>
+        <w:numPr>
+          <w:ilvl w:val="0"/>
+          <w:numId w:val="2"/>
+        </w:numPr>
+        <w:rPr>
+          <w:lang w:val="de-DE"/>
+        </w:rPr>
+      </w:pPr>
+      <w:r>
+        <w:rPr>
+          <w:lang w:val="de-DE"/>
+        </w:rPr>
+        <w:t>Tritt- und Setzstufen, Podeste: je Materialstärke auf Rohplatten verschachtelt (Faserrichtung beachtet), Bohrungen von oben auf der CNC.</w:t>
+      </w:r>
+    </w:p>
+    <w:p>
+      <w:pPr>
+        <w:pStyle w:val="ListParagraph"/>
+        <w:numPr>
+          <w:ilvl w:val="0"/>
+          <w:numId w:val="2"/>
+        </w:numPr>
+        <w:rPr>
+          <w:lang w:val="de-DE"/>
+        </w:rPr>
+      </w:pPr>
+      <w:r>
+        <w:rPr>
+          <w:lang w:val="de-DE"/>
+        </w:rPr>
+        <w:t>Eingestemmte Wangen, geschwungene Handläufe, Geländerpfosten: nie verschachtelt, je Teil ein eigener Rohling (blank_margin ringsum) und eine eigene TCN. Nur so kommt das Bohraggregat seitlich an die Kanten.</w:t>
+      </w:r>
+    </w:p>
+    <w:p>
+      <w:pPr>
+        <w:pStyle w:val="ListParagraph"/>
+        <w:numPr>
+          <w:ilvl w:val="0"/>
+          <w:numId w:val="2"/>
+        </w:numPr>
+        <w:rPr>
+          <w:lang w:val="de-DE"/>
+        </w:rPr>
+      </w:pPr>
+      <w:r>
+        <w:rPr>
+          <w:lang w:val="de-DE"/>
+        </w:rPr>
+        <w:t>Aufgesattelte Wangen: je Wange ein 3D-Programm. Außenkontur in Stufen (sat_zstep), danach die Schrägen mit dem Seitenaggregat; Schrägen mit umgekehrter Neigung auf Seite 2 (Wenden, vorher formatiert) oder markiert.</w:t>
+      </w:r>
+    </w:p>
+    <w:p>
+      <w:pPr>
+        <w:pStyle w:val="ListParagraph"/>
+        <w:numPr>
+          <w:ilvl w:val="0"/>
+          <w:numId w:val="2"/>
+        </w:numPr>
+        <w:rPr>
+          <w:lang w:val="de-DE"/>
+        </w:rPr>
+      </w:pPr>
+      <w:r>
+        <w:rPr>
+          <w:lang w:val="de-DE"/>
+        </w:rPr>
+        <w:t>Nicht als TCN: Geländerstäbe (Zuschnitt), gerade Handläufe (klassisch), Holm, Massivtreppe. Sie stehen in Teileliste und Nacharbeit.</w:t>
+      </w:r>
+    </w:p>
+    <w:p>
+      <w:pPr>
+        <w:pStyle w:val="Heading3"/>
+        <w:rPr>
+          <w:lang w:val="de-DE"/>
+        </w:rPr>
+      </w:pPr>
+      <w:r>
+        <w:rPr>
+          <w:lang w:val="de-DE"/>
+        </w:rPr>
+        <w:t>Maschinengrenzen</w:t>
+      </w:r>
+    </w:p>
+    <w:p>
+      <w:pPr>
+        <w:pStyle w:val="ListParagraph"/>
+        <w:numPr>
+          <w:ilvl w:val="0"/>
+          <w:numId w:val="2"/>
+        </w:numPr>
+        <w:rPr>
+          <w:lang w:val="de-DE"/>
+        </w:rPr>
+      </w:pPr>
+      <w:r>
+        <w:rPr>
+          <w:lang w:val="de-DE"/>
+        </w:rPr>
+        <w:t>Verfahrweg X 3200 mm (mach_l): TpaCAD nimmt keine TCN mit einer Länge über 3200 mm an. Längere Teile werden in zwei Läufe geteilt.</w:t>
+      </w:r>
+    </w:p>
+    <w:p>
+      <w:pPr>
+        <w:pStyle w:val="ListParagraph"/>
+        <w:numPr>
+          <w:ilvl w:val="0"/>
+          <w:numId w:val="2"/>
+        </w:numPr>
+        <w:rPr>
+          <w:lang w:val="de-DE"/>
+        </w:rPr>
+      </w:pPr>
+      <w:r>
+        <w:rPr>
+          <w:lang w:val="de-DE"/>
+        </w:rPr>
+        <w:t>Breite Y höchstens 1300 mm (mach_w): keine TCN ist breiter; Rohplatten werden auf diese Breite verschachtelt, breitere Rohlinge nicht exportiert.</w:t>
+      </w:r>
+    </w:p>
+    <w:p>
+      <w:pPr>
+        <w:pStyle w:val="ListParagraph"/>
+        <w:numPr>
+          <w:ilvl w:val="0"/>
+          <w:numId w:val="2"/>
+        </w:numPr>
+        <w:rPr>
+          <w:lang w:val="de-DE"/>
+        </w:rPr>
+      </w:pPr>
+      <w:r>
+        <w:rPr>
+          <w:lang w:val="de-DE"/>
+        </w:rPr>
+        <w:t>Fräser Außenkontur automatisch je Materialstärke: 1300 (Ø 18,27, bis 54 mm Tiefe), sonst 1004 (Ø 20, bis 107 mm).</w:t>
+      </w:r>
+    </w:p>
+    <w:p>
+      <w:pPr>
+        <w:pStyle w:val="Heading3"/>
+        <w:rPr>
+          <w:lang w:val="de-DE"/>
+        </w:rPr>
+      </w:pPr>
+      <w:r>
+        <w:rPr>
+          <w:lang w:val="de-DE"/>
+        </w:rPr>
+        <w:t>Überlange Teile: Lauf A und Lauf B</w:t>
+      </w:r>
+    </w:p>
+    <w:p>
+      <w:pPr>
+        <w:pStyle w:val="ListParagraph"/>
+        <w:numPr>
+          <w:ilvl w:val="0"/>
+          <w:numId w:val="2"/>
+        </w:numPr>
+        <w:rPr>
+          <w:lang w:val="de-DE"/>
+        </w:rPr>
+      </w:pPr>
+      <w:r>
+        <w:rPr>
+          <w:lang w:val="de-DE"/>
+        </w:rPr>
+        <w:t>Das Werkstück darf nur in eine Richtung über den Tisch ragen. Darum wird ein langes Teil (bis 6 m) immer am selben X-Anschlag bearbeitet.</w:t>
+      </w:r>
+    </w:p>
+    <w:p>
+      <w:pPr>
+        <w:pStyle w:val="ListParagraph"/>
+        <w:numPr>
+          <w:ilvl w:val="0"/>
+          <w:numId w:val="2"/>
+        </w:numPr>
+        <w:rPr>
+          <w:lang w:val="de-DE"/>
+        </w:rPr>
+      </w:pPr>
+      <w:r>
+        <w:rPr>
+          <w:lang w:val="de-DE"/>
+        </w:rPr>
+        <w:t>Lauf A (Feld N1, Kopfzeile s3): Ende A am linken X-Anschlag, Kante 1 am vorderen Y-Anschlag.</w:t>
+      </w:r>
+    </w:p>
+    <w:p>
+      <w:pPr>
+        <w:pStyle w:val="ListParagraph"/>
+        <w:numPr>
+          <w:ilvl w:val="0"/>
+          <w:numId w:val="2"/>
+        </w:numPr>
+        <w:rPr>
+          <w:lang w:val="de-DE"/>
+        </w:rPr>
+      </w:pPr>
+      <w:r>
+        <w:rPr>
+          <w:lang w:val="de-DE"/>
+        </w:rPr>
+        <w:t>Dann das Teil in der Ebene um 180° drehen. Lauf B (Feld N, Kopfzeile s6): Ende B am selben Anschlag, Kante 1 hinten; im Programm x′ = L − x, y′ = W − y. Die Rohbreite kürzt sich heraus, nur die Rohlänge muss stimmen.</w:t>
+      </w:r>
+    </w:p>
+    <w:p>
+      <w:pPr>
+        <w:pStyle w:val="ListParagraph"/>
+        <w:numPr>
+          <w:ilvl w:val="0"/>
+          <w:numId w:val="2"/>
+        </w:numPr>
+        <w:rPr>
+          <w:lang w:val="de-DE"/>
+        </w:rPr>
+      </w:pPr>
+      <w:r>
+        <w:rPr>
+          <w:lang w:val="de-DE"/>
+        </w:rPr>
+        <w:t>Geteilt wird zwischen den Bearbeitungen, die Außenkontur überlappt um long_overlap; Haltestege (tab_n, tab_w, tab_h) im zuerst gefrästen Lauf. Das Einrichtblatt steht in der Nacharbeit, die Vorschau zeigt die Teilung.</w:t>
+      </w:r>
+    </w:p>
+    <w:p>
+      <w:pPr>
+        <w:pStyle w:val="Heading3"/>
+        <w:rPr>
+          <w:lang w:val="de-DE"/>
+        </w:rPr>
+      </w:pPr>
+      <w:r>
+        <w:rPr>
+          <w:lang w:val="de-DE"/>
+        </w:rPr>
+        <w:t>Reihenfolge im Programm</w:t>
+      </w:r>
+    </w:p>
+    <w:p>
+      <w:pPr>
+        <w:rPr>
+          <w:lang w:val="de-DE"/>
+        </w:rPr>
+      </w:pPr>
+      <w:r>
+        <w:rPr>
+          <w:lang w:val="de-DE"/>
+        </w:rPr>
+        <w:t>Gravur und Markierungen, Nuten, Bohrungen von oben, dann die Außenkontur (Durchfräsen um overcut), zuletzt die Bearbeitungen mit dem Aggregat: Schrägen und waagerechte Bohrungen, je Bearbeitung eine Hilfsfläche (GSIDE). Beim Wenden beginnt Seite 1 mit dem Formatieren des Rohlings; die formatierten Kanten sind der Bezug für Seite 2.</w:t>
+      </w:r>
+    </w:p>
+    <w:p>
+      <w:pPr>
+        <w:pStyle w:val="Heading3"/>
+        <w:rPr>
+          <w:lang w:val="de-DE"/>
+        </w:rPr>
+      </w:pPr>
+      <w:r>
+        <w:rPr>
+          <w:lang w:val="de-DE"/>
+        </w:rPr>
+        <w:t>Bohrungen</w:t>
+      </w:r>
+    </w:p>
+    <w:p>
+      <w:pPr>
+        <w:pStyle w:val="ListParagraph"/>
+        <w:numPr>
+          <w:ilvl w:val="0"/>
+          <w:numId w:val="2"/>
+        </w:numPr>
+        <w:rPr>
+          <w:lang w:val="de-DE"/>
+        </w:rPr>
+      </w:pPr>
+      <w:r>
+        <w:rPr>
+          <w:lang w:val="de-DE"/>
+        </w:rPr>
+        <w:t>Trittstufen: Stabbohrungen von oben auf der CNC; Dübel zur aufgesattelten Wange von unten von Hand (Bohrliste).</w:t>
+      </w:r>
+    </w:p>
+    <w:p>
+      <w:pPr>
+        <w:pStyle w:val="ListParagraph"/>
+        <w:numPr>
+          <w:ilvl w:val="0"/>
+          <w:numId w:val="2"/>
+        </w:numPr>
+        <w:rPr>
+          <w:lang w:val="de-DE"/>
+        </w:rPr>
+      </w:pPr>
+      <w:r>
+        <w:rPr>
+          <w:lang w:val="de-DE"/>
+        </w:rPr>
+        <w:t>Eingestemmte Wange: Stabbohrungen in die Oberkante und Dübel in die Stirn am Pfosten mit dem Bohraggregat (drill_wange „bohren“) oder nur markiert.</w:t>
+      </w:r>
+    </w:p>
+    <w:p>
+      <w:pPr>
+        <w:pStyle w:val="ListParagraph"/>
+        <w:numPr>
+          <w:ilvl w:val="0"/>
+          <w:numId w:val="2"/>
+        </w:numPr>
+        <w:rPr>
+          <w:lang w:val="de-DE"/>
+        </w:rPr>
+      </w:pPr>
+      <w:r>
+        <w:rPr>
+          <w:lang w:val="de-DE"/>
+        </w:rPr>
+        <w:t>Aufgesattelte Wange: Dübel in die Auflagerkante mit dem Bohraggregat oder markiert.</w:t>
+      </w:r>
+    </w:p>
+    <w:p>
+      <w:pPr>
+        <w:pStyle w:val="ListParagraph"/>
+        <w:numPr>
+          <w:ilvl w:val="0"/>
+          <w:numId w:val="2"/>
+        </w:numPr>
+        <w:rPr>
+          <w:lang w:val="de-DE"/>
+        </w:rPr>
+      </w:pPr>
+      <w:r>
+        <w:rPr>
+          <w:lang w:val="de-DE"/>
+        </w:rPr>
+        <w:t>Geschwungener Handlauf: Stabbohrungen von unten mit dem Aggregat. Gerader Handlauf und Pfosten: Maße in Nacharbeit bzw. …_Pfosten_Bearbeitung.txt.</w:t>
+      </w:r>
+    </w:p>
+    <w:p>
+      <w:pPr>
+        <w:pStyle w:val="Heading3"/>
+        <w:rPr>
+          <w:lang w:val="de-DE"/>
+        </w:rPr>
+      </w:pPr>
+      <w:r>
+        <w:rPr>
+          <w:lang w:val="de-DE"/>
+        </w:rPr>
+        <w:t>Fräsliste</w:t>
+      </w:r>
+    </w:p>
+    <w:p>
+      <w:pPr>
+        <w:rPr>
+          <w:lang w:val="de-DE"/>
+        </w:rPr>
+      </w:pPr>
+      <w:r>
+        <w:rPr>
+          <w:lang w:val="de-DE"/>
+        </w:rPr>
+        <w:t>Liste_&lt;Name&gt;.xmlst enthält eine Zeile je geschriebener TCN in Export-Reihenfolge. Maße und Feld kommen aus der TCN selbst (DL, DH, DS; Feld s1 → 9, s3 → 3, s6 → 6). Die Zuordnung s3/s6 zu den Feldern der Liste ist in TpaCAD noch zu prüfen.</w:t>
       </w:r>
     </w:p>
     <w:p>

</xml_diff>

<commit_message>
Dokumentation auf Stand 2.21.0: Pfosten-TCN, Stoß aufgesattelte Wange
Co-Authored-By: Claude Opus 5.5 (1M context) <noreply@anthropic.com>
Claude-Session: https://claude.ai/code/session_01ScmvP4mHuXkqMwoe7RN8Lk
</commit_message>
<xml_diff>
--- a/Treppenbau-Plugin für SketchUp – Dokumentation.docx
+++ b/Treppenbau-Plugin für SketchUp – Dokumentation.docx
@@ -26,7 +26,7 @@
         <w:rPr>
           <w:lang w:val="de-DE"/>
         </w:rPr>
-        <w:t>Oct 6, 2026 · @Jürgen Späder · Version 2.19.0</w:t>
+        <w:t>Oct 8, 2026 · @Jürgen Späder · Version 2.21.0</w:t>
       </w:r>
     </w:p>
     <w:p>
@@ -53,7 +53,7 @@
         <w:rPr>
           <w:lang w:val="de-DE"/>
         </w:rPr>
-        <w:t xml:space="preserve">Treppenbau (Version 2.19.0) erzeugt in SketchUp parametrische Treppen – gerade, gewendelt, mit Podest oder als Wendeltreppe – und gibt die Holzteile als fertige TCN-Fräsprogramme für TpaCAD aus. Alle Maße im Treppendialog sind in </w:t>
+        <w:t xml:space="preserve">Treppenbau (Version 2.21.0) erzeugt in SketchUp parametrische Treppen – gerade, gewendelt, mit Podest oder als Wendeltreppe – und gibt die Holzteile als fertige TCN-Fräsprogramme für TpaCAD aus. Alle Maße im Treppendialog sind in </w:t>
       </w:r>
       <w:r>
         <w:rPr>
@@ -263,7 +263,71 @@
         <w:rPr>
           <w:lang w:val="de-DE"/>
         </w:rPr>
-        <w:t>Diese Fassung beschreibt Version 2.19.0 (treppenbau_2.19.0.rbz). Die vorige Fassung (02.10.2026) entsprach Version 2.6.0. Seitdem sind die folgenden Änderungen hinzugekommen; die betroffenen Abschnitte weiter unten sind ergänzt. Neu sind außerdem die Abschnitte „Behobene Fehler“, „Konstruktion – warum was wie aufgebaut ist“ und „CNC-Logik“. Alles wurde bisher nur mit Testskripten außerhalb von SketchUp und TpaCAD geprüft.</w:t>
+        <w:t>Diese Fassung beschreibt Version 2.21.0 (treppenbau_2.21.0.rbz). Die vorige Fassung (02.10.2026) entsprach Version 2.6.0. Seitdem sind die folgenden Änderungen hinzugekommen; die betroffenen Abschnitte weiter unten sind ergänzt. Neu sind außerdem die Abschnitte „Behobene Fehler“, „Konstruktion – warum was wie aufgebaut ist“ und „CNC-Logik“. Alles wurde bisher nur mit Testskripten außerhalb von SketchUp und TpaCAD geprüft.</w:t>
+      </w:r>
+    </w:p>
+    <w:p>
+      <w:pPr>
+        <w:pStyle w:val="Heading3"/>
+        <w:rPr>
+          <w:lang w:val="de-DE"/>
+        </w:rPr>
+      </w:pPr>
+      <w:r>
+        <w:rPr>
+          <w:lang w:val="de-DE"/>
+        </w:rPr>
+        <w:t>Version 2.21.0 – Aufgesattelte Wange: Stirn am Stoß verdeckt</w:t>
+      </w:r>
+    </w:p>
+    <w:p>
+      <w:pPr>
+        <w:pStyle w:val="ListParagraph"/>
+        <w:numPr>
+          <w:ilvl w:val="0"/>
+          <w:numId w:val="2"/>
+        </w:numPr>
+        <w:rPr>
+          <w:lang w:val="de-DE"/>
+        </w:rPr>
+      </w:pPr>
+      <w:r>
+        <w:rPr>
+          <w:lang w:val="de-DE"/>
+        </w:rPr>
+        <w:t>Läuft am Stoß das obere Brett durch (U-Treppe am Zwischenstück, dreiläufig), liegt die Unterkante über der Anlage des unteren Bretts jetzt waagerecht auf dessen Unterkante; erst danach steigt sie. Die Stirn der vorherigen Wange hängt nicht mehr darunter heraus, die Unterkanten schließen bündig.</w:t>
+      </w:r>
+    </w:p>
+    <w:p>
+      <w:pPr>
+        <w:pStyle w:val="Heading3"/>
+        <w:rPr>
+          <w:lang w:val="de-DE"/>
+        </w:rPr>
+      </w:pPr>
+      <w:r>
+        <w:rPr>
+          <w:lang w:val="de-DE"/>
+        </w:rPr>
+        <w:t>Version 2.20.0 – Pfosten-TCN mit Taschen und Dübellöchern</w:t>
+      </w:r>
+    </w:p>
+    <w:p>
+      <w:pPr>
+        <w:pStyle w:val="ListParagraph"/>
+        <w:numPr>
+          <w:ilvl w:val="0"/>
+          <w:numId w:val="2"/>
+        </w:numPr>
+        <w:rPr>
+          <w:lang w:val="de-DE"/>
+        </w:rPr>
+      </w:pPr>
+      <w:r>
+        <w:rPr>
+          <w:lang w:val="de-DE"/>
+        </w:rPr>
+        <w:t>Geländerpfosten bekommen je bearbeitete Fläche ein eigenes Programm mit dieser Fläche oben: Taschen für die Stufen mit dem Nutfräser, Dübellöcher (Gegenstück zu den Wangendübeln) und Schraubenbohrungen senkrecht. Zwischen den Programmen wird der Pfosten um 90° nach hinten abgerollt.</w:t>
       </w:r>
     </w:p>
     <w:tbl>
@@ -1038,6 +1102,82 @@
                 <w:lang w:val="de-DE"/>
               </w:rPr>
               <w:t>Dübel zwischen Stufe und aufgesattelter Wange (Wange CNC, Stufe Bohrliste)</w:t>
+            </w:r>
+          </w:p>
+        </w:tc>
+      </w:tr>
+      <w:tr>
+        <w:tc>
+          <w:tcPr>
+            <w:tcW w:w="4680" w:type="dxa"/>
+          </w:tcPr>
+          <w:p>
+            <w:pPr>
+              <w:rPr>
+                <w:lang w:val="de-DE"/>
+              </w:rPr>
+            </w:pPr>
+            <w:r>
+              <w:rPr>
+                <w:lang w:val="de-DE"/>
+              </w:rPr>
+              <w:t>2.20.0</w:t>
+            </w:r>
+          </w:p>
+        </w:tc>
+        <w:tc>
+          <w:tcPr>
+            <w:tcW w:w="4680" w:type="dxa"/>
+          </w:tcPr>
+          <w:p>
+            <w:pPr>
+              <w:rPr>
+                <w:lang w:val="de-DE"/>
+              </w:rPr>
+            </w:pPr>
+            <w:r>
+              <w:rPr>
+                <w:lang w:val="de-DE"/>
+              </w:rPr>
+              <w:t>Pfosten-TCN mit Taschen, Dübel- und Schraubenbohrungen (je Fläche ein Programm)</w:t>
+            </w:r>
+          </w:p>
+        </w:tc>
+      </w:tr>
+      <w:tr>
+        <w:tc>
+          <w:tcPr>
+            <w:tcW w:w="4680" w:type="dxa"/>
+          </w:tcPr>
+          <w:p>
+            <w:pPr>
+              <w:rPr>
+                <w:lang w:val="de-DE"/>
+              </w:rPr>
+            </w:pPr>
+            <w:r>
+              <w:rPr>
+                <w:lang w:val="de-DE"/>
+              </w:rPr>
+              <w:t>2.21.0</w:t>
+            </w:r>
+          </w:p>
+        </w:tc>
+        <w:tc>
+          <w:tcPr>
+            <w:tcW w:w="4680" w:type="dxa"/>
+          </w:tcPr>
+          <w:p>
+            <w:pPr>
+              <w:rPr>
+                <w:lang w:val="de-DE"/>
+              </w:rPr>
+            </w:pPr>
+            <w:r>
+              <w:rPr>
+                <w:lang w:val="de-DE"/>
+              </w:rPr>
+              <w:t>Aufgesattelte Wange: Stirn am Stoß verdeckt, Unterkanten bündig</w:t>
             </w:r>
           </w:p>
         </w:tc>
@@ -3192,6 +3332,70 @@
           </w:p>
         </w:tc>
       </w:tr>
+      <w:tr>
+        <w:tc>
+          <w:tcPr>
+            <w:tcW w:w="3120" w:type="dxa"/>
+          </w:tcPr>
+          <w:p>
+            <w:r>
+              <w:t>2.20.0</w:t>
+            </w:r>
+          </w:p>
+        </w:tc>
+        <w:tc>
+          <w:tcPr>
+            <w:tcW w:w="3120" w:type="dxa"/>
+          </w:tcPr>
+          <w:p>
+            <w:r>
+              <w:t>Pfosten-TCN ohne Taschen für die Stufen und ohne Dübellöcher für die Wangen</w:t>
+            </w:r>
+          </w:p>
+        </w:tc>
+        <w:tc>
+          <w:tcPr>
+            <w:tcW w:w="3120" w:type="dxa"/>
+          </w:tcPr>
+          <w:p>
+            <w:r>
+              <w:t>Je bearbeitete Pfostenfläche ein Programm von oben (Taschen, Dübel, Schrauben), Einrichtung zum Abrollen im TCN-Kopf und in …_Nacharbeit.txt.</w:t>
+            </w:r>
+          </w:p>
+        </w:tc>
+      </w:tr>
+      <w:tr>
+        <w:tc>
+          <w:tcPr>
+            <w:tcW w:w="3120" w:type="dxa"/>
+          </w:tcPr>
+          <w:p>
+            <w:r>
+              <w:t>2.21.0</w:t>
+            </w:r>
+          </w:p>
+        </w:tc>
+        <w:tc>
+          <w:tcPr>
+            <w:tcW w:w="3120" w:type="dxa"/>
+          </w:tcPr>
+          <w:p>
+            <w:r>
+              <w:t>Aufgesattelte Wange: am Stoß mit durchlaufendem oberem Brett war die Stirn der vorherigen Wange unter der Unterkante sichtbar</w:t>
+            </w:r>
+          </w:p>
+        </w:tc>
+        <w:tc>
+          <w:tcPr>
+            <w:tcW w:w="3120" w:type="dxa"/>
+          </w:tcPr>
+          <w:p>
+            <w:r>
+              <w:t>Unterkante des durchlaufenden Bretts über die Anlage waagerecht auf Höhe der vorherigen, danach Steigung – Stoß schließt flächig.</w:t>
+            </w:r>
+          </w:p>
+        </w:tc>
+      </w:tr>
     </w:tbl>
     <w:p>
       <w:pPr>
@@ -3267,7 +3471,7 @@
           <w:rStyle w:val="CodeChar"/>
           <w:lang w:val="de-DE"/>
         </w:rPr>
-        <w:t>treppenbau_2.19.0.rbz (GitHub-Repository jimmycd/sketchup-treppenbauer, Hauptordner auf main) auswählen und bestätigen.</w:t>
+        <w:t>treppenbau_2.21.0.rbz (GitHub-Repository jimmycd/sketchup-treppenbauer, Hauptordner auf main) auswählen und bestätigen.</w:t>
       </w:r>
     </w:p>
     <w:p>
@@ -14407,20 +14611,6 @@
     </w:p>
     <w:p>
       <w:pPr>
-        <w:pStyle w:val="Heading3"/>
-        <w:rPr>
-          <w:lang w:val="de-DE"/>
-        </w:rPr>
-      </w:pPr>
-      <w:r>
-        <w:rPr>
-          <w:lang w:val="de-DE"/>
-        </w:rPr>
-        <w:t>Pfosten als Zwischenstücke</w:t>
-      </w:r>
-    </w:p>
-    <w:p>
-      <w:pPr>
         <w:pStyle w:val="ListParagraph"/>
         <w:numPr>
           <w:ilvl w:val="0"/>
@@ -14434,7 +14624,21 @@
         <w:rPr>
           <w:lang w:val="de-DE"/>
         </w:rPr>
-        <w:t>Auf Geländerseiten stehen Pfosten am Antritt, am Austritt und an jedem Laufwechsel. Die Wangen enden dort rechtwinklig an der Pfostenfläche; der Pfosten ist das Zwischenstück der Ecke.</w:t>
+        <w:t>Aufgesattelte Wange, durchlaufendes oberes Brett (U, dreiläufig): die Unterkante des oberen Bretts liegt über die ganze Anlage des unteren waagerecht auf dessen Unterkante und steigt erst danach. So deckt das durchlaufende Brett die Stirn des vorherigen vollständig ab.</w:t>
+      </w:r>
+    </w:p>
+    <w:p>
+      <w:pPr>
+        <w:pStyle w:val="Heading3"/>
+        <w:rPr>
+          <w:lang w:val="de-DE"/>
+        </w:rPr>
+      </w:pPr>
+      <w:r>
+        <w:rPr>
+          <w:lang w:val="de-DE"/>
+        </w:rPr>
+        <w:t>Pfosten als Zwischenstücke</w:t>
       </w:r>
     </w:p>
     <w:p>
@@ -14452,7 +14656,7 @@
         <w:rPr>
           <w:lang w:val="de-DE"/>
         </w:rPr>
-        <w:t>Wange und Pfosten sind verdübelt (dowel_d 10 mm, 2–4 Dübel je Wangenende, nicht in den Stufennuten). Die Stirnbohrung in der eingestemmten Wange macht die CNC.</w:t>
+        <w:t>Auf Geländerseiten stehen Pfosten am Antritt, am Austritt und an jedem Laufwechsel. Die Wangen enden dort rechtwinklig an der Pfostenfläche; der Pfosten ist das Zwischenstück der Ecke.</w:t>
       </w:r>
     </w:p>
     <w:p>
@@ -14470,7 +14674,43 @@
         <w:rPr>
           <w:lang w:val="de-DE"/>
         </w:rPr>
+        <w:t>Wange und Pfosten sind verdübelt (dowel_d 10 mm, 2–4 Dübel je Wangenende, nicht in den Stufennuten). Die Stirnbohrung in der eingestemmten Wange macht die CNC.</w:t>
+      </w:r>
+    </w:p>
+    <w:p>
+      <w:pPr>
+        <w:pStyle w:val="ListParagraph"/>
+        <w:numPr>
+          <w:ilvl w:val="0"/>
+          <w:numId w:val="2"/>
+        </w:numPr>
+        <w:rPr>
+          <w:lang w:val="de-DE"/>
+        </w:rPr>
+      </w:pPr>
+      <w:r>
+        <w:rPr>
+          <w:lang w:val="de-DE"/>
+        </w:rPr>
         <w:t>Tritt- und Setzstufen laufen um post_pocket (1,5 cm) in eine Tasche im Pfosten. Die Fuge ist so verdeckt und die Stufe liegt im Pfosten auf; befestigt wird mit einer Schraube oder einem Dübel durch den Pfosten.</w:t>
+      </w:r>
+    </w:p>
+    <w:p>
+      <w:pPr>
+        <w:pStyle w:val="ListParagraph"/>
+        <w:numPr>
+          <w:ilvl w:val="0"/>
+          <w:numId w:val="2"/>
+        </w:numPr>
+        <w:rPr>
+          <w:lang w:val="de-DE"/>
+        </w:rPr>
+      </w:pPr>
+      <w:r>
+        <w:rPr>
+          <w:lang w:val="de-DE"/>
+        </w:rPr>
+        <w:t>Die Taschen und Bohrungen fräst die CNC: je Pfostenfläche mit Bearbeitung ein Programm, diese Fläche oben. Der Pfosten wird dazwischen abgerollt, statt mit dem Seitenaggregat zu arbeiten: so reichen Nutfräser und Bohrer, und der schmale Pfosten muss nicht seitlich angefahren werden.</w:t>
       </w:r>
     </w:p>
     <w:p>
@@ -16559,7 +16799,7 @@
           <w:rStyle w:val="CodeChar"/>
           <w:lang w:val="de-DE"/>
         </w:rPr>
-        <w:t>Haus_Treppe_EG_Handlauf_H1.tcn – geschwungene Handläufe; Haus_Treppe_EG_Gelaenderpfosten_G1.tcn – je Geländerpfosten</w:t>
+        <w:t>Haus_Treppe_EG_Gelaenderpfosten_G1_1_Flaeche1.tcn, …_2_Flaeche2.tcn – Pfosten mit Taschen/Bohrungen: je Fläche ein Programm in Reihenfolge (ohne Bearbeitung nur …_G1.tcn)</w:t>
       </w:r>
     </w:p>
     <w:p>
@@ -16578,7 +16818,7 @@
           <w:rStyle w:val="CodeChar"/>
           <w:lang w:val="de-DE"/>
         </w:rPr>
-        <w:t>Haus_Treppe_EG_Teileliste.csv – Spalten Nr, Teil, Bezeichnung, Stärke, Länge, Breite, Fläche m², Datei, X, Y, Drehung; Semikolon, Dezimalkomma, Windows-1252. Nicht gefräste Teile mit „keine TCN – …“.</w:t>
+        <w:t>Haus_Treppe_EG_Handlauf_H1.tcn – geschwungene Handläufe; Haus_Treppe_EG_Gelaenderpfosten_G1.tcn – je Geländerpfosten</w:t>
       </w:r>
     </w:p>
     <w:p>
@@ -16597,7 +16837,7 @@
           <w:rStyle w:val="CodeChar"/>
           <w:lang w:val="de-DE"/>
         </w:rPr>
-        <w:t>Haus_Treppe_EG_Nacharbeit.txt – Einrichtung der Läufe A/B, Nacharbeit aufgesattelter Wangen, Bohrliste der Stufendübel (aufgesattelte Wange), Geländerstäbe (Zuschnitt) und gerade Handläufe (Maße, Bohrungen)</w:t>
+        <w:t>Haus_Treppe_EG_Teileliste.csv – Spalten Nr, Teil, Bezeichnung, Stärke, Länge, Breite, Fläche m², Datei, X, Y, Drehung; Semikolon, Dezimalkomma, Windows-1252. Nicht gefräste Teile mit „keine TCN – …“.</w:t>
       </w:r>
     </w:p>
     <w:p>
@@ -16616,7 +16856,7 @@
           <w:rStyle w:val="CodeChar"/>
           <w:lang w:val="de-DE"/>
         </w:rPr>
-        <w:t>Haus_Treppe_EG_Pfosten_Bearbeitung.txt – Taschen und Bohrungen je Pfostenfläche</w:t>
+        <w:t>Haus_Treppe_EG_Nacharbeit.txt – Einrichtung der Läufe A/B, Nacharbeit aufgesattelter Wangen, Bohrliste der Stufendübel (aufgesattelte Wange), Geländerstäbe (Zuschnitt) und gerade Handläufe (Maße, Bohrungen)</w:t>
       </w:r>
     </w:p>
     <w:p>
@@ -16635,6 +16875,25 @@
           <w:rStyle w:val="CodeChar"/>
           <w:lang w:val="de-DE"/>
         </w:rPr>
+        <w:t>Haus_Treppe_EG_Pfosten_Bearbeitung.txt – Taschen und Bohrungen je Pfostenfläche (Kontrollliste; gefräst wird nach den Pfosten-TCN)</w:t>
+      </w:r>
+    </w:p>
+    <w:p>
+      <w:pPr>
+        <w:pStyle w:val="ListParagraph"/>
+        <w:numPr>
+          <w:ilvl w:val="0"/>
+          <w:numId w:val="6"/>
+        </w:numPr>
+        <w:rPr>
+          <w:lang w:val="de-DE"/>
+        </w:rPr>
+      </w:pPr>
+      <w:r>
+        <w:rPr>
+          <w:rStyle w:val="CodeChar"/>
+          <w:lang w:val="de-DE"/>
+        </w:rPr>
         <w:t>Liste_Haus_Treppe_EG.xmlst – Fräsliste für TpaCAD (eine Zeile je TCN)</w:t>
       </w:r>
     </w:p>
@@ -16730,7 +16989,7 @@
         <w:rPr>
           <w:lang w:val="de-DE"/>
         </w:rPr>
-        <w:t>Aufgesattelte Wangen: je Wange ein 3D-Programm. Außenkontur in Stufen (sat_zstep), danach die Schrägen mit dem Seitenaggregat; Schrägen mit umgekehrter Neigung auf Seite 2 (Wenden, vorher formatiert) oder markiert.</w:t>
+        <w:t>Geländerpfosten mit Taschen oder Bohrungen: Programm 1 fräst aus dem Rohling (Fläche oben, dann Außenkontur), die weiteren am fertigen Pfosten. Unterende immer am linken X-Anschlag, Pfosten am vorderen Y-Anschlag; vor jedem weiteren Programm 90° nach hinten abrollen (vordere Fläche nach oben). Die Fläche vorne steht im TCN-Kopf. Offene Taschen laufen über die Pfostenkante hinaus.</w:t>
       </w:r>
     </w:p>
     <w:p>
@@ -16748,21 +17007,7 @@
         <w:rPr>
           <w:lang w:val="de-DE"/>
         </w:rPr>
-        <w:t>Nicht als TCN: Geländerstäbe (Zuschnitt), gerade Handläufe (klassisch), Holm, Massivtreppe. Sie stehen in Teileliste und Nacharbeit.</w:t>
-      </w:r>
-    </w:p>
-    <w:p>
-      <w:pPr>
-        <w:pStyle w:val="Heading3"/>
-        <w:rPr>
-          <w:lang w:val="de-DE"/>
-        </w:rPr>
-      </w:pPr>
-      <w:r>
-        <w:rPr>
-          <w:lang w:val="de-DE"/>
-        </w:rPr>
-        <w:t>Maschinengrenzen</w:t>
+        <w:t>Aufgesattelte Wangen: je Wange ein 3D-Programm. Außenkontur in Stufen (sat_zstep), danach die Schrägen mit dem Seitenaggregat; Schrägen mit umgekehrter Neigung auf Seite 2 (Wenden, vorher formatiert) oder markiert.</w:t>
       </w:r>
     </w:p>
     <w:p>
@@ -16780,7 +17025,21 @@
         <w:rPr>
           <w:lang w:val="de-DE"/>
         </w:rPr>
-        <w:t>Verfahrweg X 3200 mm (mach_l): TpaCAD nimmt keine TCN mit einer Länge über 3200 mm an. Längere Teile werden in zwei Läufe geteilt.</w:t>
+        <w:t>Nicht als TCN: Geländerstäbe (Zuschnitt), gerade Handläufe (klassisch), Holm, Massivtreppe. Sie stehen in Teileliste und Nacharbeit.</w:t>
+      </w:r>
+    </w:p>
+    <w:p>
+      <w:pPr>
+        <w:pStyle w:val="Heading3"/>
+        <w:rPr>
+          <w:lang w:val="de-DE"/>
+        </w:rPr>
+      </w:pPr>
+      <w:r>
+        <w:rPr>
+          <w:lang w:val="de-DE"/>
+        </w:rPr>
+        <w:t>Maschinengrenzen</w:t>
       </w:r>
     </w:p>
     <w:p>
@@ -16798,7 +17057,7 @@
         <w:rPr>
           <w:lang w:val="de-DE"/>
         </w:rPr>
-        <w:t>Breite Y höchstens 1300 mm (mach_w): keine TCN ist breiter; Rohplatten werden auf diese Breite verschachtelt, breitere Rohlinge nicht exportiert.</w:t>
+        <w:t>Verfahrweg X 3200 mm (mach_l): TpaCAD nimmt keine TCN mit einer Länge über 3200 mm an. Längere Teile werden in zwei Läufe geteilt.</w:t>
       </w:r>
     </w:p>
     <w:p>
@@ -16816,21 +17075,7 @@
         <w:rPr>
           <w:lang w:val="de-DE"/>
         </w:rPr>
-        <w:t>Fräser Außenkontur automatisch je Materialstärke: 1300 (Ø 18,27, bis 54 mm Tiefe), sonst 1004 (Ø 20, bis 107 mm).</w:t>
-      </w:r>
-    </w:p>
-    <w:p>
-      <w:pPr>
-        <w:pStyle w:val="Heading3"/>
-        <w:rPr>
-          <w:lang w:val="de-DE"/>
-        </w:rPr>
-      </w:pPr>
-      <w:r>
-        <w:rPr>
-          <w:lang w:val="de-DE"/>
-        </w:rPr>
-        <w:t>Überlange Teile: Lauf A und Lauf B</w:t>
+        <w:t>Breite Y höchstens 1300 mm (mach_w): keine TCN ist breiter; Rohplatten werden auf diese Breite verschachtelt, breitere Rohlinge nicht exportiert.</w:t>
       </w:r>
     </w:p>
     <w:p>
@@ -16848,7 +17093,21 @@
         <w:rPr>
           <w:lang w:val="de-DE"/>
         </w:rPr>
-        <w:t>Das Werkstück darf nur in eine Richtung über den Tisch ragen. Darum wird ein langes Teil (bis 6 m) immer am selben X-Anschlag bearbeitet.</w:t>
+        <w:t>Fräser Außenkontur automatisch je Materialstärke: 1300 (Ø 18,27, bis 54 mm Tiefe), sonst 1004 (Ø 20, bis 107 mm).</w:t>
+      </w:r>
+    </w:p>
+    <w:p>
+      <w:pPr>
+        <w:pStyle w:val="Heading3"/>
+        <w:rPr>
+          <w:lang w:val="de-DE"/>
+        </w:rPr>
+      </w:pPr>
+      <w:r>
+        <w:rPr>
+          <w:lang w:val="de-DE"/>
+        </w:rPr>
+        <w:t>Überlange Teile: Lauf A und Lauf B</w:t>
       </w:r>
     </w:p>
     <w:p>
@@ -16866,7 +17125,7 @@
         <w:rPr>
           <w:lang w:val="de-DE"/>
         </w:rPr>
-        <w:t>Lauf A (Feld N1, Kopfzeile s3): Ende A am linken X-Anschlag, Kante 1 am vorderen Y-Anschlag.</w:t>
+        <w:t>Das Werkstück darf nur in eine Richtung über den Tisch ragen. Darum wird ein langes Teil (bis 6 m) immer am selben X-Anschlag bearbeitet.</w:t>
       </w:r>
     </w:p>
     <w:p>
@@ -16884,7 +17143,7 @@
         <w:rPr>
           <w:lang w:val="de-DE"/>
         </w:rPr>
-        <w:t>Dann das Teil in der Ebene um 180° drehen. Lauf B (Feld N, Kopfzeile s6): Ende B am selben Anschlag, Kante 1 hinten; im Programm x′ = L − x, y′ = W − y. Die Rohbreite kürzt sich heraus, nur die Rohlänge muss stimmen.</w:t>
+        <w:t>Lauf A (Feld N1, Kopfzeile s3): Ende A am linken X-Anschlag, Kante 1 am vorderen Y-Anschlag.</w:t>
       </w:r>
     </w:p>
     <w:p>
@@ -16902,48 +17161,7 @@
         <w:rPr>
           <w:lang w:val="de-DE"/>
         </w:rPr>
-        <w:t>Geteilt wird zwischen den Bearbeitungen, die Außenkontur überlappt um long_overlap; Haltestege (tab_n, tab_w, tab_h) im zuerst gefrästen Lauf. Das Einrichtblatt steht in der Nacharbeit, die Vorschau zeigt die Teilung.</w:t>
-      </w:r>
-    </w:p>
-    <w:p>
-      <w:pPr>
-        <w:pStyle w:val="Heading3"/>
-        <w:rPr>
-          <w:lang w:val="de-DE"/>
-        </w:rPr>
-      </w:pPr>
-      <w:r>
-        <w:rPr>
-          <w:lang w:val="de-DE"/>
-        </w:rPr>
-        <w:t>Reihenfolge im Programm</w:t>
-      </w:r>
-    </w:p>
-    <w:p>
-      <w:pPr>
-        <w:rPr>
-          <w:lang w:val="de-DE"/>
-        </w:rPr>
-      </w:pPr>
-      <w:r>
-        <w:rPr>
-          <w:lang w:val="de-DE"/>
-        </w:rPr>
-        <w:t>Gravur und Markierungen, Nuten, Bohrungen von oben, dann die Außenkontur (Durchfräsen um overcut), zuletzt die Bearbeitungen mit dem Aggregat: Schrägen und waagerechte Bohrungen, je Bearbeitung eine Hilfsfläche (GSIDE). Beim Wenden beginnt Seite 1 mit dem Formatieren des Rohlings; die formatierten Kanten sind der Bezug für Seite 2.</w:t>
-      </w:r>
-    </w:p>
-    <w:p>
-      <w:pPr>
-        <w:pStyle w:val="Heading3"/>
-        <w:rPr>
-          <w:lang w:val="de-DE"/>
-        </w:rPr>
-      </w:pPr>
-      <w:r>
-        <w:rPr>
-          <w:lang w:val="de-DE"/>
-        </w:rPr>
-        <w:t>Bohrungen</w:t>
+        <w:t>Dann das Teil in der Ebene um 180° drehen. Lauf B (Feld N, Kopfzeile s6): Ende B am selben Anschlag, Kante 1 hinten; im Programm x′ = L − x, y′ = W − y. Die Rohbreite kürzt sich heraus, nur die Rohlänge muss stimmen.</w:t>
       </w:r>
     </w:p>
     <w:p>
@@ -16961,7 +17179,48 @@
         <w:rPr>
           <w:lang w:val="de-DE"/>
         </w:rPr>
-        <w:t>Trittstufen: Stabbohrungen von oben auf der CNC; Dübel zur aufgesattelten Wange von unten von Hand (Bohrliste).</w:t>
+        <w:t>Geteilt wird zwischen den Bearbeitungen, die Außenkontur überlappt um long_overlap; Haltestege (tab_n, tab_w, tab_h) im zuerst gefrästen Lauf. Das Einrichtblatt steht in der Nacharbeit, die Vorschau zeigt die Teilung.</w:t>
+      </w:r>
+    </w:p>
+    <w:p>
+      <w:pPr>
+        <w:pStyle w:val="Heading3"/>
+        <w:rPr>
+          <w:lang w:val="de-DE"/>
+        </w:rPr>
+      </w:pPr>
+      <w:r>
+        <w:rPr>
+          <w:lang w:val="de-DE"/>
+        </w:rPr>
+        <w:t>Reihenfolge im Programm</w:t>
+      </w:r>
+    </w:p>
+    <w:p>
+      <w:pPr>
+        <w:rPr>
+          <w:lang w:val="de-DE"/>
+        </w:rPr>
+      </w:pPr>
+      <w:r>
+        <w:rPr>
+          <w:lang w:val="de-DE"/>
+        </w:rPr>
+        <w:t>Gravur und Markierungen, Nuten, Bohrungen von oben, dann die Außenkontur (Durchfräsen um overcut), zuletzt die Bearbeitungen mit dem Aggregat: Schrägen und waagerechte Bohrungen, je Bearbeitung eine Hilfsfläche (GSIDE). Beim Wenden beginnt Seite 1 mit dem Formatieren des Rohlings; die formatierten Kanten sind der Bezug für Seite 2.</w:t>
+      </w:r>
+    </w:p>
+    <w:p>
+      <w:pPr>
+        <w:pStyle w:val="Heading3"/>
+        <w:rPr>
+          <w:lang w:val="de-DE"/>
+        </w:rPr>
+      </w:pPr>
+      <w:r>
+        <w:rPr>
+          <w:lang w:val="de-DE"/>
+        </w:rPr>
+        <w:t>Bohrungen</w:t>
       </w:r>
     </w:p>
     <w:p>
@@ -16979,7 +17238,7 @@
         <w:rPr>
           <w:lang w:val="de-DE"/>
         </w:rPr>
-        <w:t>Eingestemmte Wange: Stabbohrungen in die Oberkante und Dübel in die Stirn am Pfosten mit dem Bohraggregat (drill_wange „bohren“) oder nur markiert.</w:t>
+        <w:t>Trittstufen: Stabbohrungen von oben auf der CNC; Dübel zur aufgesattelten Wange von unten von Hand (Bohrliste).</w:t>
       </w:r>
     </w:p>
     <w:p>
@@ -16997,7 +17256,7 @@
         <w:rPr>
           <w:lang w:val="de-DE"/>
         </w:rPr>
-        <w:t>Aufgesattelte Wange: Dübel in die Auflagerkante mit dem Bohraggregat oder markiert.</w:t>
+        <w:t>Eingestemmte Wange: Stabbohrungen in die Oberkante und Dübel in die Stirn am Pfosten mit dem Bohraggregat (drill_wange „bohren“) oder nur markiert.</w:t>
       </w:r>
     </w:p>
     <w:p>
@@ -17015,7 +17274,25 @@
         <w:rPr>
           <w:lang w:val="de-DE"/>
         </w:rPr>
-        <w:t>Geschwungener Handlauf: Stabbohrungen von unten mit dem Aggregat. Gerader Handlauf und Pfosten: Maße in Nacharbeit bzw. …_Pfosten_Bearbeitung.txt.</w:t>
+        <w:t>Aufgesattelte Wange: Dübel in die Auflagerkante mit dem Bohraggregat oder markiert.</w:t>
+      </w:r>
+    </w:p>
+    <w:p>
+      <w:pPr>
+        <w:pStyle w:val="ListParagraph"/>
+        <w:numPr>
+          <w:ilvl w:val="0"/>
+          <w:numId w:val="2"/>
+        </w:numPr>
+        <w:rPr>
+          <w:lang w:val="de-DE"/>
+        </w:rPr>
+      </w:pPr>
+      <w:r>
+        <w:rPr>
+          <w:lang w:val="de-DE"/>
+        </w:rPr>
+        <w:t>Geschwungener Handlauf: Stabbohrungen von unten mit dem Aggregat. Gerader Handlauf: Maße in der Nacharbeit. Pfosten: Dübel- und Schraubenbohrungen senkrecht von oben im Programm der jeweiligen Fläche.</w:t>
       </w:r>
     </w:p>
     <w:p>
@@ -18559,7 +18836,25 @@
         <w:rPr>
           <w:lang w:val="de-DE"/>
         </w:rPr>
-        <w:t>Sattelwangen sind an Ecken stumpf gestoßen (keine Gehrung); die Unterkante des oberen Bretts kann an der Ecke einen Knick haben.</w:t>
+        <w:t>Sattelwangen sind an Ecken stumpf gestoßen (keine Gehrung); die Unterkante des oberen Bretts kann an der Ecke einen Knick haben. Am Podest-Innenstoß steht die Stirn des Podestbretts über der Oberkante der unteren Wange.</w:t>
+      </w:r>
+    </w:p>
+    <w:p>
+      <w:pPr>
+        <w:pStyle w:val="ListParagraph"/>
+        <w:numPr>
+          <w:ilvl w:val="0"/>
+          <w:numId w:val="7"/>
+        </w:numPr>
+        <w:rPr>
+          <w:lang w:val="de-DE"/>
+        </w:rPr>
+      </w:pPr>
+      <w:r>
+        <w:rPr>
+          <w:lang w:val="de-DE"/>
+        </w:rPr>
+        <w:t>In TpaCAD noch ungeprüft: Pfosten-Taschen und die 75 mm tiefe Schraubenbohrung, Spannen des schmalen Pfostens, versenkter Y-Anschlag bei offenen Taschen.</w:t>
       </w:r>
     </w:p>
     <w:p>

</xml_diff>